<commit_message>
Documentation update and totals fix
The form now shows the totals as soon as rows are pulled in or a document is
removed from a draft, instead of reading zero until the pass is saved.

Documentation: the manual, feature list, configuration reference and product plan
are brought up to date (document list and remove button, party address and contact
rules, purpose behaviour, picker settings, corrected rule and settings counts, and
corrected compliance troubleshooting). The Word documents are regenerated in the
Auriga IT standard, and docs/tools/build_word.js rebuilds them from the Markdown.

Co-Authored-By: Claude Sonnet 5.5 <noreply@anthropic.com>
</commit_message>
<xml_diff>
--- a/docs/word/Gate Pass Management - Feature List.docx
+++ b/docs/word/Gate Pass Management - Feature List.docx
@@ -21,9 +21,9 @@
       <w:r>
         <w:drawing>
           <wp:inline distT="0" distB="0" distL="0" distR="0">
-            <wp:extent cx="1504950" cy="695325"/>
+            <wp:extent cx="2009775" cy="933450"/>
             <wp:effectExtent t="0" r="0" b="0" l="0"/>
-            <wp:docPr id="1" name="" descr="" title=""/>
+            <wp:docPr id="2" name=""/>
             <wp:cNvGraphicFramePr>
               <a:graphicFrameLocks xmlns:a="http://schemas.openxmlformats.org/drawingml/2006/main" noChangeAspect="1"/>
             </wp:cNvGraphicFramePr>
@@ -46,7 +46,7 @@
                   <pic:spPr bwMode="auto">
                     <a:xfrm>
                       <a:off x="0" y="0"/>
-                      <a:ext cx="1504950" cy="695325"/>
+                      <a:ext cx="2009775" cy="933450"/>
                     </a:xfrm>
                     <a:prstGeom prst="rect">
                       <a:avLst/>
@@ -89,15 +89,11 @@
     </w:p>
     <w:p>
       <w:pPr>
-        <w:spacing w:after="800" w:before="0" w:line="240" w:lineRule="auto"/>
-      </w:pPr>
-      <w:r>
-        <w:rPr>
-          <w:rFonts w:ascii="Google Sans Flex Normal" w:cs="Google Sans Flex Normal" w:eastAsia="Google Sans Flex Normal" w:hAnsi="Google Sans Flex Normal"/>
-          <w:b w:val="false"/>
-          <w:bCs w:val="false"/>
-          <w:i w:val="false"/>
-          <w:iCs w:val="false"/>
+        <w:spacing w:after="800" w:before="0"/>
+      </w:pPr>
+      <w:r>
+        <w:rPr>
+          <w:rFonts w:ascii="Google Sans Flex Normal" w:cs="Google Sans Flex Normal" w:eastAsia="Google Sans Flex Normal" w:hAnsi="Google Sans Flex Normal"/>
           <w:color w:val="94a3b8"/>
           <w:sz w:val="36"/>
           <w:szCs w:val="36"/>
@@ -109,12 +105,12 @@
       <w:tblPr>
         <w:tblW w:type="dxa" w:w="9602"/>
         <w:tblBorders>
-          <w:top w:val="nil"/>
-          <w:left w:val="nil"/>
-          <w:bottom w:val="nil"/>
-          <w:right w:val="nil"/>
-          <w:insideH w:val="nil"/>
-          <w:insideV w:val="nil"/>
+          <w:top w:val="single" w:color="auto" w:sz="4"/>
+          <w:left w:val="single" w:color="auto" w:sz="4"/>
+          <w:bottom w:val="single" w:color="auto" w:sz="4"/>
+          <w:right w:val="single" w:color="auto" w:sz="4"/>
+          <w:insideH w:val="single" w:color="auto" w:sz="4"/>
+          <w:insideV w:val="single" w:color="auto" w:sz="4"/>
         </w:tblBorders>
         <w:tblLayout w:type="fixed"/>
       </w:tblPr>
@@ -126,12 +122,12 @@
           <w:tcPr>
             <w:tcW w:type="dxa" w:w="9602"/>
             <w:tcBorders>
-              <w:top w:val="nil"/>
+              <w:top w:val="none" w:color="FFFFFF" w:sz="0"/>
               <w:left w:val="single" w:color="3F7DDE" w:sz="24"/>
-              <w:bottom w:val="nil"/>
-              <w:right w:val="nil"/>
+              <w:bottom w:val="none" w:color="FFFFFF" w:sz="0"/>
+              <w:right w:val="none" w:color="FFFFFF" w:sz="0"/>
             </w:tcBorders>
-            <w:shd w:fill="f1f5f9" w:val="clear"/>
+            <w:shd w:fill="f1f5f9" w:color="auto" w:val="clear"/>
             <w:tcMar>
               <w:top w:type="dxa" w:w="288"/>
               <w:left w:type="dxa" w:w="288"/>
@@ -148,8 +144,6 @@
                 <w:rFonts w:ascii="Google Sans Flex Medium" w:cs="Google Sans Flex Medium" w:eastAsia="Google Sans Flex Medium" w:hAnsi="Google Sans Flex Medium"/>
                 <w:b w:val="false"/>
                 <w:bCs w:val="false"/>
-                <w:i w:val="false"/>
-                <w:iCs w:val="false"/>
                 <w:color w:val="0f172a"/>
                 <w:sz w:val="28"/>
                 <w:szCs w:val="28"/>
@@ -159,10 +153,6 @@
             <w:r>
               <w:rPr>
                 <w:rFonts w:ascii="Google Sans Flex Normal" w:cs="Google Sans Flex Normal" w:eastAsia="Google Sans Flex Normal" w:hAnsi="Google Sans Flex Normal"/>
-                <w:b w:val="false"/>
-                <w:bCs w:val="false"/>
-                <w:i w:val="false"/>
-                <w:iCs w:val="false"/>
                 <w:color w:val="0f172a"/>
                 <w:sz w:val="28"/>
                 <w:szCs w:val="28"/>
@@ -179,8 +169,6 @@
                 <w:rFonts w:ascii="Google Sans Flex Medium" w:cs="Google Sans Flex Medium" w:eastAsia="Google Sans Flex Medium" w:hAnsi="Google Sans Flex Medium"/>
                 <w:b w:val="false"/>
                 <w:bCs w:val="false"/>
-                <w:i w:val="false"/>
-                <w:iCs w:val="false"/>
                 <w:color w:val="0f172a"/>
                 <w:sz w:val="28"/>
                 <w:szCs w:val="28"/>
@@ -190,10 +178,6 @@
             <w:r>
               <w:rPr>
                 <w:rFonts w:ascii="Google Sans Flex Normal" w:cs="Google Sans Flex Normal" w:eastAsia="Google Sans Flex Normal" w:hAnsi="Google Sans Flex Normal"/>
-                <w:b w:val="false"/>
-                <w:bCs w:val="false"/>
-                <w:i w:val="false"/>
-                <w:iCs w:val="false"/>
                 <w:color w:val="0f172a"/>
                 <w:sz w:val="28"/>
                 <w:szCs w:val="28"/>
@@ -210,8 +194,6 @@
                 <w:rFonts w:ascii="Google Sans Flex Medium" w:cs="Google Sans Flex Medium" w:eastAsia="Google Sans Flex Medium" w:hAnsi="Google Sans Flex Medium"/>
                 <w:b w:val="false"/>
                 <w:bCs w:val="false"/>
-                <w:i w:val="false"/>
-                <w:iCs w:val="false"/>
                 <w:color w:val="0f172a"/>
                 <w:sz w:val="28"/>
                 <w:szCs w:val="28"/>
@@ -221,10 +203,6 @@
             <w:r>
               <w:rPr>
                 <w:rFonts w:ascii="Google Sans Flex Normal" w:cs="Google Sans Flex Normal" w:eastAsia="Google Sans Flex Normal" w:hAnsi="Google Sans Flex Normal"/>
-                <w:b w:val="false"/>
-                <w:bCs w:val="false"/>
-                <w:i w:val="false"/>
-                <w:iCs w:val="false"/>
                 <w:color w:val="0f172a"/>
                 <w:sz w:val="28"/>
                 <w:szCs w:val="28"/>
@@ -241,8 +219,6 @@
                 <w:rFonts w:ascii="Google Sans Flex Medium" w:cs="Google Sans Flex Medium" w:eastAsia="Google Sans Flex Medium" w:hAnsi="Google Sans Flex Medium"/>
                 <w:b w:val="false"/>
                 <w:bCs w:val="false"/>
-                <w:i w:val="false"/>
-                <w:iCs w:val="false"/>
                 <w:color w:val="0f172a"/>
                 <w:sz w:val="28"/>
                 <w:szCs w:val="28"/>
@@ -252,15 +228,11 @@
             <w:r>
               <w:rPr>
                 <w:rFonts w:ascii="Google Sans Flex Normal" w:cs="Google Sans Flex Normal" w:eastAsia="Google Sans Flex Normal" w:hAnsi="Google Sans Flex Normal"/>
-                <w:b w:val="false"/>
-                <w:bCs w:val="false"/>
-                <w:i w:val="false"/>
-                <w:iCs w:val="false"/>
                 <w:color w:val="0f172a"/>
                 <w:sz w:val="28"/>
                 <w:szCs w:val="28"/>
               </w:rPr>
-              <w:t xml:space="preserve">1.0</w:t>
+              <w:t xml:space="preserve">1.0.0</w:t>
             </w:r>
           </w:p>
           <w:p>
@@ -272,8 +244,6 @@
                 <w:rFonts w:ascii="Google Sans Flex Medium" w:cs="Google Sans Flex Medium" w:eastAsia="Google Sans Flex Medium" w:hAnsi="Google Sans Flex Medium"/>
                 <w:b w:val="false"/>
                 <w:bCs w:val="false"/>
-                <w:i w:val="false"/>
-                <w:iCs w:val="false"/>
                 <w:color w:val="0f172a"/>
                 <w:sz w:val="28"/>
                 <w:szCs w:val="28"/>
@@ -283,15 +253,11 @@
             <w:r>
               <w:rPr>
                 <w:rFonts w:ascii="Google Sans Flex Normal" w:cs="Google Sans Flex Normal" w:eastAsia="Google Sans Flex Normal" w:hAnsi="Google Sans Flex Normal"/>
-                <w:b w:val="false"/>
-                <w:bCs w:val="false"/>
-                <w:i w:val="false"/>
-                <w:iCs w:val="false"/>
                 <w:color w:val="0f172a"/>
                 <w:sz w:val="28"/>
                 <w:szCs w:val="28"/>
               </w:rPr>
-              <w:t xml:space="preserve">07 August 2026</w:t>
+              <w:t xml:space="preserve">31 October 2026</w:t>
             </w:r>
           </w:p>
           <w:p>
@@ -303,8 +269,6 @@
                 <w:rFonts w:ascii="Google Sans Flex Medium" w:cs="Google Sans Flex Medium" w:eastAsia="Google Sans Flex Medium" w:hAnsi="Google Sans Flex Medium"/>
                 <w:b w:val="false"/>
                 <w:bCs w:val="false"/>
-                <w:i w:val="false"/>
-                <w:iCs w:val="false"/>
                 <w:color w:val="0f172a"/>
                 <w:sz w:val="28"/>
                 <w:szCs w:val="28"/>
@@ -314,10 +278,6 @@
             <w:r>
               <w:rPr>
                 <w:rFonts w:ascii="Google Sans Flex Normal" w:cs="Google Sans Flex Normal" w:eastAsia="Google Sans Flex Normal" w:hAnsi="Google Sans Flex Normal"/>
-                <w:b w:val="false"/>
-                <w:bCs w:val="false"/>
-                <w:i w:val="false"/>
-                <w:iCs w:val="false"/>
                 <w:color w:val="0f172a"/>
                 <w:sz w:val="28"/>
                 <w:szCs w:val="28"/>
@@ -339,6 +299,7 @@
         <w:keepNext/>
         <w:spacing w:after="115" w:before="240" w:line="240" w:lineRule="auto"/>
       </w:pPr>
+      <w:bookmarkStart w:name="bm_1" w:id="1"/>
       <w:r>
         <w:rPr>
           <w:rFonts w:ascii="Google Sans Flex Medium" w:cs="Google Sans Flex Medium" w:eastAsia="Google Sans Flex Medium" w:hAnsi="Google Sans Flex Medium"/>
@@ -352,6 +313,7 @@
         </w:rPr>
         <w:t xml:space="preserve">Gate Pass Management - Feature List</w:t>
       </w:r>
+      <w:bookmarkEnd w:id="1"/>
     </w:p>
     <w:p>
       <w:pPr>
@@ -377,6 +339,7 @@
         <w:keepNext/>
         <w:spacing w:after="92" w:before="200" w:line="240" w:lineRule="auto"/>
       </w:pPr>
+      <w:bookmarkStart w:name="bm_2" w:id="2"/>
       <w:r>
         <w:rPr>
           <w:rFonts w:ascii="Google Sans Flex Medium" w:cs="Google Sans Flex Medium" w:eastAsia="Google Sans Flex Medium" w:hAnsi="Google Sans Flex Medium"/>
@@ -390,6 +353,7 @@
         </w:rPr>
         <w:t xml:space="preserve">The one-line pitch</w:t>
       </w:r>
+      <w:bookmarkEnd w:id="2"/>
     </w:p>
     <w:p>
       <w:pPr>
@@ -398,8 +362,8 @@
       <w:r>
         <w:rPr>
           <w:rFonts w:ascii="Google Sans Flex Medium" w:cs="Google Sans Flex Medium" w:eastAsia="Google Sans Flex Medium" w:hAnsi="Google Sans Flex Medium"/>
-          <w:b/>
-          <w:bCs/>
+          <w:b w:val="false"/>
+          <w:bCs w:val="false"/>
           <w:i w:val="false"/>
           <w:iCs w:val="false"/>
           <w:color w:val="0f172a"/>
@@ -415,6 +379,7 @@
         <w:keepNext/>
         <w:spacing w:after="92" w:before="200" w:line="240" w:lineRule="auto"/>
       </w:pPr>
+      <w:bookmarkStart w:name="bm_3" w:id="3"/>
       <w:r>
         <w:rPr>
           <w:rFonts w:ascii="Google Sans Flex Medium" w:cs="Google Sans Flex Medium" w:eastAsia="Google Sans Flex Medium" w:hAnsi="Google Sans Flex Medium"/>
@@ -428,6 +393,7 @@
         </w:rPr>
         <w:t xml:space="preserve">The elevator version</w:t>
       </w:r>
+      <w:bookmarkEnd w:id="3"/>
     </w:p>
     <w:p>
       <w:pPr>
@@ -489,6 +455,7 @@
         <w:keepNext/>
         <w:spacing w:after="92" w:before="200" w:line="240" w:lineRule="auto"/>
       </w:pPr>
+      <w:bookmarkStart w:name="bm_4" w:id="4"/>
       <w:r>
         <w:rPr>
           <w:rFonts w:ascii="Google Sans Flex Medium" w:cs="Google Sans Flex Medium" w:eastAsia="Google Sans Flex Medium" w:hAnsi="Google Sans Flex Medium"/>
@@ -502,6 +469,7 @@
         </w:rPr>
         <w:t xml:space="preserve">Positioning</w:t>
       </w:r>
+      <w:bookmarkEnd w:id="4"/>
     </w:p>
     <w:tbl>
       <w:tblPr>
@@ -517,29 +485,106 @@
         <w:tblLayout w:type="fixed"/>
       </w:tblPr>
       <w:tblGrid>
-        <w:gridCol w:w="1600"/>
-        <w:gridCol w:w="8002"/>
+        <w:gridCol w:w="1825"/>
+        <w:gridCol w:w="7777"/>
       </w:tblGrid>
       <w:tr>
         <w:trPr>
+          <w:cantSplit/>
           <w:tblHeader/>
         </w:trPr>
         <w:tc>
           <w:tcPr>
-            <w:tcW w:type="dxa" w:w="1600"/>
+            <w:tcW w:type="dxa" w:w="1825"/>
             <w:tcBorders>
               <w:top w:val="single" w:color="cccccc" w:sz="4"/>
               <w:left w:val="single" w:color="cccccc" w:sz="4"/>
               <w:bottom w:val="single" w:color="cccccc" w:sz="4"/>
               <w:right w:val="single" w:color="cccccc" w:sz="4"/>
             </w:tcBorders>
-            <w:shd w:fill="3F7DDE" w:val="clear"/>
+            <w:shd w:fill="3F7DDE" w:color="auto" w:val="clear"/>
             <w:tcMar>
               <w:top w:type="dxa" w:w="144"/>
               <w:left w:type="dxa" w:w="144"/>
               <w:bottom w:type="dxa" w:w="144"/>
               <w:right w:type="dxa" w:w="144"/>
             </w:tcMar>
+            <w:vAlign w:val="top"/>
+          </w:tcPr>
+          <w:p>
+            <w:pPr>
+              <w:spacing w:after="0" w:before="0" w:line="240" w:lineRule="auto"/>
+            </w:pPr>
+            <w:r>
+              <w:rPr>
+                <w:rFonts w:ascii="Google Sans Flex Medium" w:cs="Google Sans Flex Medium" w:eastAsia="Google Sans Flex Medium" w:hAnsi="Google Sans Flex Medium"/>
+                <w:b w:val="false"/>
+                <w:bCs w:val="false"/>
+                <w:color w:val="ffffff"/>
+                <w:sz w:val="24"/>
+                <w:szCs w:val="24"/>
+              </w:rPr>
+              <w:t xml:space="preserve"/>
+            </w:r>
+          </w:p>
+        </w:tc>
+        <w:tc>
+          <w:tcPr>
+            <w:tcW w:type="dxa" w:w="7777"/>
+            <w:tcBorders>
+              <w:top w:val="single" w:color="cccccc" w:sz="4"/>
+              <w:left w:val="single" w:color="cccccc" w:sz="4"/>
+              <w:bottom w:val="single" w:color="cccccc" w:sz="4"/>
+              <w:right w:val="single" w:color="cccccc" w:sz="4"/>
+            </w:tcBorders>
+            <w:shd w:fill="3F7DDE" w:color="auto" w:val="clear"/>
+            <w:tcMar>
+              <w:top w:type="dxa" w:w="144"/>
+              <w:left w:type="dxa" w:w="144"/>
+              <w:bottom w:type="dxa" w:w="144"/>
+              <w:right w:type="dxa" w:w="144"/>
+            </w:tcMar>
+            <w:vAlign w:val="top"/>
+          </w:tcPr>
+          <w:p>
+            <w:pPr>
+              <w:spacing w:after="0" w:before="0" w:line="240" w:lineRule="auto"/>
+            </w:pPr>
+            <w:r>
+              <w:rPr>
+                <w:rFonts w:ascii="Google Sans Flex Medium" w:cs="Google Sans Flex Medium" w:eastAsia="Google Sans Flex Medium" w:hAnsi="Google Sans Flex Medium"/>
+                <w:b w:val="false"/>
+                <w:bCs w:val="false"/>
+                <w:color w:val="ffffff"/>
+                <w:sz w:val="24"/>
+                <w:szCs w:val="24"/>
+              </w:rPr>
+              <w:t xml:space="preserve"/>
+            </w:r>
+          </w:p>
+        </w:tc>
+      </w:tr>
+      <w:tr>
+        <w:trPr>
+          <w:cantSplit/>
+        </w:trPr>
+        <w:tc>
+          <w:tcPr>
+            <w:tcW w:type="dxa" w:w="1825"/>
+            <w:tcBorders>
+              <w:top w:val="single" w:color="cccccc" w:sz="4"/>
+              <w:left w:val="single" w:color="cccccc" w:sz="4"/>
+              <w:bottom w:val="single" w:color="cccccc" w:sz="4"/>
+              <w:right w:val="single" w:color="cccccc" w:sz="4"/>
+            </w:tcBorders>
+            <w:shd w:fill="FAFAFA" w:color="auto" w:val="clear"/>
+            <w:tcMar>
+              <w:top w:type="dxa" w:w="144"/>
+              <w:left w:type="dxa" w:w="144"/>
+              <w:bottom w:type="dxa" w:w="144"/>
+              <w:right w:type="dxa" w:w="144"/>
+            </w:tcMar>
+            <w:vAlign w:val="top"/>
           </w:tcPr>
           <w:p>
             <w:pPr>
@@ -552,80 +597,6 @@
                 <w:bCs w:val="false"/>
                 <w:i w:val="false"/>
                 <w:iCs w:val="false"/>
-                <w:color w:val="ffffff"/>
-                <w:sz w:val="24"/>
-                <w:szCs w:val="24"/>
-              </w:rPr>
-              <w:t xml:space="preserve"/>
-            </w:r>
-          </w:p>
-        </w:tc>
-        <w:tc>
-          <w:tcPr>
-            <w:tcW w:type="dxa" w:w="8002"/>
-            <w:tcBorders>
-              <w:top w:val="single" w:color="cccccc" w:sz="4"/>
-              <w:left w:val="single" w:color="cccccc" w:sz="4"/>
-              <w:bottom w:val="single" w:color="cccccc" w:sz="4"/>
-              <w:right w:val="single" w:color="cccccc" w:sz="4"/>
-            </w:tcBorders>
-            <w:shd w:fill="3F7DDE" w:val="clear"/>
-            <w:tcMar>
-              <w:top w:type="dxa" w:w="144"/>
-              <w:left w:type="dxa" w:w="144"/>
-              <w:bottom w:type="dxa" w:w="144"/>
-              <w:right w:type="dxa" w:w="144"/>
-            </w:tcMar>
-          </w:tcPr>
-          <w:p>
-            <w:pPr>
-              <w:spacing w:after="0" w:before="0" w:line="240" w:lineRule="auto"/>
-            </w:pPr>
-            <w:r>
-              <w:rPr>
-                <w:rFonts w:ascii="Google Sans Flex Medium" w:cs="Google Sans Flex Medium" w:eastAsia="Google Sans Flex Medium" w:hAnsi="Google Sans Flex Medium"/>
-                <w:b w:val="false"/>
-                <w:bCs w:val="false"/>
-                <w:i w:val="false"/>
-                <w:iCs w:val="false"/>
-                <w:color w:val="ffffff"/>
-                <w:sz w:val="24"/>
-                <w:szCs w:val="24"/>
-              </w:rPr>
-              <w:t xml:space="preserve"/>
-            </w:r>
-          </w:p>
-        </w:tc>
-      </w:tr>
-      <w:tr>
-        <w:tc>
-          <w:tcPr>
-            <w:tcW w:type="dxa" w:w="1600"/>
-            <w:tcBorders>
-              <w:top w:val="single" w:color="cccccc" w:sz="4"/>
-              <w:left w:val="single" w:color="cccccc" w:sz="4"/>
-              <w:bottom w:val="single" w:color="cccccc" w:sz="4"/>
-              <w:right w:val="single" w:color="cccccc" w:sz="4"/>
-            </w:tcBorders>
-            <w:shd w:fill="FAFAFA" w:val="clear"/>
-            <w:tcMar>
-              <w:top w:type="dxa" w:w="144"/>
-              <w:left w:type="dxa" w:w="144"/>
-              <w:bottom w:type="dxa" w:w="144"/>
-              <w:right w:type="dxa" w:w="144"/>
-            </w:tcMar>
-          </w:tcPr>
-          <w:p>
-            <w:pPr>
-              <w:spacing w:after="0" w:before="0" w:line="240" w:lineRule="auto"/>
-            </w:pPr>
-            <w:r>
-              <w:rPr>
-                <w:rFonts w:ascii="Google Sans Flex Medium" w:cs="Google Sans Flex Medium" w:eastAsia="Google Sans Flex Medium" w:hAnsi="Google Sans Flex Medium"/>
-                <w:b/>
-                <w:bCs/>
-                <w:i w:val="false"/>
-                <w:iCs w:val="false"/>
                 <w:color w:val="0f172a"/>
                 <w:sz w:val="22"/>
                 <w:szCs w:val="22"/>
@@ -636,20 +607,21 @@
         </w:tc>
         <w:tc>
           <w:tcPr>
-            <w:tcW w:type="dxa" w:w="8002"/>
+            <w:tcW w:type="dxa" w:w="7777"/>
             <w:tcBorders>
               <w:top w:val="single" w:color="cccccc" w:sz="4"/>
               <w:left w:val="single" w:color="cccccc" w:sz="4"/>
               <w:bottom w:val="single" w:color="cccccc" w:sz="4"/>
               <w:right w:val="single" w:color="cccccc" w:sz="4"/>
             </w:tcBorders>
-            <w:shd w:fill="FAFAFA" w:val="clear"/>
+            <w:shd w:fill="FAFAFA" w:color="auto" w:val="clear"/>
             <w:tcMar>
               <w:top w:type="dxa" w:w="144"/>
               <w:left w:type="dxa" w:w="144"/>
               <w:bottom w:type="dxa" w:w="144"/>
               <w:right w:type="dxa" w:w="144"/>
             </w:tcMar>
+            <w:vAlign w:val="top"/>
           </w:tcPr>
           <w:p>
             <w:pPr>
@@ -672,22 +644,26 @@
         </w:tc>
       </w:tr>
       <w:tr>
+        <w:trPr>
+          <w:cantSplit/>
+        </w:trPr>
         <w:tc>
           <w:tcPr>
-            <w:tcW w:type="dxa" w:w="1600"/>
+            <w:tcW w:type="dxa" w:w="1825"/>
             <w:tcBorders>
               <w:top w:val="single" w:color="cccccc" w:sz="4"/>
               <w:left w:val="single" w:color="cccccc" w:sz="4"/>
               <w:bottom w:val="single" w:color="cccccc" w:sz="4"/>
               <w:right w:val="single" w:color="cccccc" w:sz="4"/>
             </w:tcBorders>
-            <w:shd w:fill="FAFAFA" w:val="clear"/>
+            <w:shd w:fill="FAFAFA" w:color="auto" w:val="clear"/>
             <w:tcMar>
               <w:top w:type="dxa" w:w="144"/>
               <w:left w:type="dxa" w:w="144"/>
               <w:bottom w:type="dxa" w:w="144"/>
               <w:right w:type="dxa" w:w="144"/>
             </w:tcMar>
+            <w:vAlign w:val="top"/>
           </w:tcPr>
           <w:p>
             <w:pPr>
@@ -696,8 +672,8 @@
             <w:r>
               <w:rPr>
                 <w:rFonts w:ascii="Google Sans Flex Medium" w:cs="Google Sans Flex Medium" w:eastAsia="Google Sans Flex Medium" w:hAnsi="Google Sans Flex Medium"/>
-                <w:b/>
-                <w:bCs/>
+                <w:b w:val="false"/>
+                <w:bCs w:val="false"/>
                 <w:i w:val="false"/>
                 <w:iCs w:val="false"/>
                 <w:color w:val="0f172a"/>
@@ -710,20 +686,21 @@
         </w:tc>
         <w:tc>
           <w:tcPr>
-            <w:tcW w:type="dxa" w:w="8002"/>
+            <w:tcW w:type="dxa" w:w="7777"/>
             <w:tcBorders>
               <w:top w:val="single" w:color="cccccc" w:sz="4"/>
               <w:left w:val="single" w:color="cccccc" w:sz="4"/>
               <w:bottom w:val="single" w:color="cccccc" w:sz="4"/>
               <w:right w:val="single" w:color="cccccc" w:sz="4"/>
             </w:tcBorders>
-            <w:shd w:fill="FAFAFA" w:val="clear"/>
+            <w:shd w:fill="FAFAFA" w:color="auto" w:val="clear"/>
             <w:tcMar>
               <w:top w:type="dxa" w:w="144"/>
               <w:left w:type="dxa" w:w="144"/>
               <w:bottom w:type="dxa" w:w="144"/>
               <w:right w:type="dxa" w:w="144"/>
             </w:tcMar>
+            <w:vAlign w:val="top"/>
           </w:tcPr>
           <w:p>
             <w:pPr>
@@ -746,22 +723,26 @@
         </w:tc>
       </w:tr>
       <w:tr>
+        <w:trPr>
+          <w:cantSplit/>
+        </w:trPr>
         <w:tc>
           <w:tcPr>
-            <w:tcW w:type="dxa" w:w="1600"/>
+            <w:tcW w:type="dxa" w:w="1825"/>
             <w:tcBorders>
               <w:top w:val="single" w:color="cccccc" w:sz="4"/>
               <w:left w:val="single" w:color="cccccc" w:sz="4"/>
               <w:bottom w:val="single" w:color="cccccc" w:sz="4"/>
               <w:right w:val="single" w:color="cccccc" w:sz="4"/>
             </w:tcBorders>
-            <w:shd w:fill="FAFAFA" w:val="clear"/>
+            <w:shd w:fill="FAFAFA" w:color="auto" w:val="clear"/>
             <w:tcMar>
               <w:top w:type="dxa" w:w="144"/>
               <w:left w:type="dxa" w:w="144"/>
               <w:bottom w:type="dxa" w:w="144"/>
               <w:right w:type="dxa" w:w="144"/>
             </w:tcMar>
+            <w:vAlign w:val="top"/>
           </w:tcPr>
           <w:p>
             <w:pPr>
@@ -770,8 +751,8 @@
             <w:r>
               <w:rPr>
                 <w:rFonts w:ascii="Google Sans Flex Medium" w:cs="Google Sans Flex Medium" w:eastAsia="Google Sans Flex Medium" w:hAnsi="Google Sans Flex Medium"/>
-                <w:b/>
-                <w:bCs/>
+                <w:b w:val="false"/>
+                <w:bCs w:val="false"/>
                 <w:i w:val="false"/>
                 <w:iCs w:val="false"/>
                 <w:color w:val="0f172a"/>
@@ -784,20 +765,21 @@
         </w:tc>
         <w:tc>
           <w:tcPr>
-            <w:tcW w:type="dxa" w:w="8002"/>
+            <w:tcW w:type="dxa" w:w="7777"/>
             <w:tcBorders>
               <w:top w:val="single" w:color="cccccc" w:sz="4"/>
               <w:left w:val="single" w:color="cccccc" w:sz="4"/>
               <w:bottom w:val="single" w:color="cccccc" w:sz="4"/>
               <w:right w:val="single" w:color="cccccc" w:sz="4"/>
             </w:tcBorders>
-            <w:shd w:fill="FAFAFA" w:val="clear"/>
+            <w:shd w:fill="FAFAFA" w:color="auto" w:val="clear"/>
             <w:tcMar>
               <w:top w:type="dxa" w:w="144"/>
               <w:left w:type="dxa" w:w="144"/>
               <w:bottom w:type="dxa" w:w="144"/>
               <w:right w:type="dxa" w:w="144"/>
             </w:tcMar>
+            <w:vAlign w:val="top"/>
           </w:tcPr>
           <w:p>
             <w:pPr>
@@ -820,22 +802,26 @@
         </w:tc>
       </w:tr>
       <w:tr>
+        <w:trPr>
+          <w:cantSplit/>
+        </w:trPr>
         <w:tc>
           <w:tcPr>
-            <w:tcW w:type="dxa" w:w="1600"/>
+            <w:tcW w:type="dxa" w:w="1825"/>
             <w:tcBorders>
               <w:top w:val="single" w:color="cccccc" w:sz="4"/>
               <w:left w:val="single" w:color="cccccc" w:sz="4"/>
               <w:bottom w:val="single" w:color="cccccc" w:sz="4"/>
               <w:right w:val="single" w:color="cccccc" w:sz="4"/>
             </w:tcBorders>
-            <w:shd w:fill="FAFAFA" w:val="clear"/>
+            <w:shd w:fill="FAFAFA" w:color="auto" w:val="clear"/>
             <w:tcMar>
               <w:top w:type="dxa" w:w="144"/>
               <w:left w:type="dxa" w:w="144"/>
               <w:bottom w:type="dxa" w:w="144"/>
               <w:right w:type="dxa" w:w="144"/>
             </w:tcMar>
+            <w:vAlign w:val="top"/>
           </w:tcPr>
           <w:p>
             <w:pPr>
@@ -844,8 +830,8 @@
             <w:r>
               <w:rPr>
                 <w:rFonts w:ascii="Google Sans Flex Medium" w:cs="Google Sans Flex Medium" w:eastAsia="Google Sans Flex Medium" w:hAnsi="Google Sans Flex Medium"/>
-                <w:b/>
-                <w:bCs/>
+                <w:b w:val="false"/>
+                <w:bCs w:val="false"/>
                 <w:i w:val="false"/>
                 <w:iCs w:val="false"/>
                 <w:color w:val="0f172a"/>
@@ -858,20 +844,21 @@
         </w:tc>
         <w:tc>
           <w:tcPr>
-            <w:tcW w:type="dxa" w:w="8002"/>
+            <w:tcW w:type="dxa" w:w="7777"/>
             <w:tcBorders>
               <w:top w:val="single" w:color="cccccc" w:sz="4"/>
               <w:left w:val="single" w:color="cccccc" w:sz="4"/>
               <w:bottom w:val="single" w:color="cccccc" w:sz="4"/>
               <w:right w:val="single" w:color="cccccc" w:sz="4"/>
             </w:tcBorders>
-            <w:shd w:fill="FAFAFA" w:val="clear"/>
+            <w:shd w:fill="FAFAFA" w:color="auto" w:val="clear"/>
             <w:tcMar>
               <w:top w:type="dxa" w:w="144"/>
               <w:left w:type="dxa" w:w="144"/>
               <w:bottom w:type="dxa" w:w="144"/>
               <w:right w:type="dxa" w:w="144"/>
             </w:tcMar>
+            <w:vAlign w:val="top"/>
           </w:tcPr>
           <w:p>
             <w:pPr>
@@ -894,22 +881,26 @@
         </w:tc>
       </w:tr>
       <w:tr>
+        <w:trPr>
+          <w:cantSplit/>
+        </w:trPr>
         <w:tc>
           <w:tcPr>
-            <w:tcW w:type="dxa" w:w="1600"/>
+            <w:tcW w:type="dxa" w:w="1825"/>
             <w:tcBorders>
               <w:top w:val="single" w:color="cccccc" w:sz="4"/>
               <w:left w:val="single" w:color="cccccc" w:sz="4"/>
               <w:bottom w:val="single" w:color="cccccc" w:sz="4"/>
               <w:right w:val="single" w:color="cccccc" w:sz="4"/>
             </w:tcBorders>
-            <w:shd w:fill="FAFAFA" w:val="clear"/>
+            <w:shd w:fill="FAFAFA" w:color="auto" w:val="clear"/>
             <w:tcMar>
               <w:top w:type="dxa" w:w="144"/>
               <w:left w:type="dxa" w:w="144"/>
               <w:bottom w:type="dxa" w:w="144"/>
               <w:right w:type="dxa" w:w="144"/>
             </w:tcMar>
+            <w:vAlign w:val="top"/>
           </w:tcPr>
           <w:p>
             <w:pPr>
@@ -918,8 +909,8 @@
             <w:r>
               <w:rPr>
                 <w:rFonts w:ascii="Google Sans Flex Medium" w:cs="Google Sans Flex Medium" w:eastAsia="Google Sans Flex Medium" w:hAnsi="Google Sans Flex Medium"/>
-                <w:b/>
-                <w:bCs/>
+                <w:b w:val="false"/>
+                <w:bCs w:val="false"/>
                 <w:i w:val="false"/>
                 <w:iCs w:val="false"/>
                 <w:color w:val="0f172a"/>
@@ -932,20 +923,21 @@
         </w:tc>
         <w:tc>
           <w:tcPr>
-            <w:tcW w:type="dxa" w:w="8002"/>
+            <w:tcW w:type="dxa" w:w="7777"/>
             <w:tcBorders>
               <w:top w:val="single" w:color="cccccc" w:sz="4"/>
               <w:left w:val="single" w:color="cccccc" w:sz="4"/>
               <w:bottom w:val="single" w:color="cccccc" w:sz="4"/>
               <w:right w:val="single" w:color="cccccc" w:sz="4"/>
             </w:tcBorders>
-            <w:shd w:fill="FAFAFA" w:val="clear"/>
+            <w:shd w:fill="FAFAFA" w:color="auto" w:val="clear"/>
             <w:tcMar>
               <w:top w:type="dxa" w:w="144"/>
               <w:left w:type="dxa" w:w="144"/>
               <w:bottom w:type="dxa" w:w="144"/>
               <w:right w:type="dxa" w:w="144"/>
             </w:tcMar>
+            <w:vAlign w:val="top"/>
           </w:tcPr>
           <w:p>
             <w:pPr>
@@ -968,22 +960,26 @@
         </w:tc>
       </w:tr>
       <w:tr>
+        <w:trPr>
+          <w:cantSplit/>
+        </w:trPr>
         <w:tc>
           <w:tcPr>
-            <w:tcW w:type="dxa" w:w="1600"/>
+            <w:tcW w:type="dxa" w:w="1825"/>
             <w:tcBorders>
               <w:top w:val="single" w:color="cccccc" w:sz="4"/>
               <w:left w:val="single" w:color="cccccc" w:sz="4"/>
               <w:bottom w:val="single" w:color="cccccc" w:sz="4"/>
               <w:right w:val="single" w:color="cccccc" w:sz="4"/>
             </w:tcBorders>
-            <w:shd w:fill="FAFAFA" w:val="clear"/>
+            <w:shd w:fill="FAFAFA" w:color="auto" w:val="clear"/>
             <w:tcMar>
               <w:top w:type="dxa" w:w="144"/>
               <w:left w:type="dxa" w:w="144"/>
               <w:bottom w:type="dxa" w:w="144"/>
               <w:right w:type="dxa" w:w="144"/>
             </w:tcMar>
+            <w:vAlign w:val="top"/>
           </w:tcPr>
           <w:p>
             <w:pPr>
@@ -992,8 +988,8 @@
             <w:r>
               <w:rPr>
                 <w:rFonts w:ascii="Google Sans Flex Medium" w:cs="Google Sans Flex Medium" w:eastAsia="Google Sans Flex Medium" w:hAnsi="Google Sans Flex Medium"/>
-                <w:b/>
-                <w:bCs/>
+                <w:b w:val="false"/>
+                <w:bCs w:val="false"/>
                 <w:i w:val="false"/>
                 <w:iCs w:val="false"/>
                 <w:color w:val="0f172a"/>
@@ -1006,20 +1002,21 @@
         </w:tc>
         <w:tc>
           <w:tcPr>
-            <w:tcW w:type="dxa" w:w="8002"/>
+            <w:tcW w:type="dxa" w:w="7777"/>
             <w:tcBorders>
               <w:top w:val="single" w:color="cccccc" w:sz="4"/>
               <w:left w:val="single" w:color="cccccc" w:sz="4"/>
               <w:bottom w:val="single" w:color="cccccc" w:sz="4"/>
               <w:right w:val="single" w:color="cccccc" w:sz="4"/>
             </w:tcBorders>
-            <w:shd w:fill="FAFAFA" w:val="clear"/>
+            <w:shd w:fill="FAFAFA" w:color="auto" w:val="clear"/>
             <w:tcMar>
               <w:top w:type="dxa" w:w="144"/>
               <w:left w:type="dxa" w:w="144"/>
               <w:bottom w:type="dxa" w:w="144"/>
               <w:right w:type="dxa" w:w="144"/>
             </w:tcMar>
+            <w:vAlign w:val="top"/>
           </w:tcPr>
           <w:p>
             <w:pPr>
@@ -1044,7 +1041,7 @@
     </w:tbl>
     <w:p>
       <w:pPr>
-        <w:spacing w:after="120" w:before="0" w:line="240" w:lineRule="auto"/>
+        <w:spacing w:after="150" w:before="0" w:line="240" w:lineRule="auto"/>
       </w:pPr>
     </w:p>
     <w:p>
@@ -1053,6 +1050,7 @@
         <w:keepNext/>
         <w:spacing w:after="92" w:before="200" w:line="240" w:lineRule="auto"/>
       </w:pPr>
+      <w:bookmarkStart w:name="bm_5" w:id="5"/>
       <w:r>
         <w:rPr>
           <w:rFonts w:ascii="Google Sans Flex Medium" w:cs="Google Sans Flex Medium" w:eastAsia="Google Sans Flex Medium" w:hAnsi="Google Sans Flex Medium"/>
@@ -1066,6 +1064,7 @@
         </w:rPr>
         <w:t xml:space="preserve">What makes it different</w:t>
       </w:r>
+      <w:bookmarkEnd w:id="5"/>
     </w:p>
     <w:p>
       <w:pPr>
@@ -1073,6 +1072,7 @@
         <w:keepNext/>
         <w:spacing w:after="69" w:before="160" w:line="240" w:lineRule="auto"/>
       </w:pPr>
+      <w:bookmarkStart w:name="bm_6" w:id="6"/>
       <w:r>
         <w:rPr>
           <w:rFonts w:ascii="Google Sans Flex Medium" w:cs="Google Sans Flex Medium" w:eastAsia="Google Sans Flex Medium" w:hAnsi="Google Sans Flex Medium"/>
@@ -1086,6 +1086,7 @@
         </w:rPr>
         <w:t xml:space="preserve">1. It is a control document, not a parallel stock system</w:t>
       </w:r>
+      <w:bookmarkEnd w:id="6"/>
     </w:p>
     <w:p>
       <w:pPr>
@@ -1107,8 +1108,8 @@
       <w:r>
         <w:rPr>
           <w:rFonts w:ascii="Google Sans Flex Medium" w:cs="Google Sans Flex Medium" w:eastAsia="Google Sans Flex Medium" w:hAnsi="Google Sans Flex Medium"/>
-          <w:b/>
-          <w:bCs/>
+          <w:b w:val="false"/>
+          <w:bCs w:val="false"/>
           <w:i w:val="false"/>
           <w:iCs w:val="false"/>
           <w:color w:val="0f172a"/>
@@ -1138,8 +1139,8 @@
       <w:r>
         <w:rPr>
           <w:rFonts w:ascii="Google Sans Flex Medium" w:cs="Google Sans Flex Medium" w:eastAsia="Google Sans Flex Medium" w:hAnsi="Google Sans Flex Medium"/>
-          <w:b/>
-          <w:bCs/>
+          <w:b w:val="false"/>
+          <w:bCs w:val="false"/>
           <w:i w:val="false"/>
           <w:iCs w:val="false"/>
           <w:color w:val="0f172a"/>
@@ -1168,6 +1169,7 @@
         <w:keepNext/>
         <w:spacing w:after="69" w:before="160" w:line="240" w:lineRule="auto"/>
       </w:pPr>
+      <w:bookmarkStart w:name="bm_7" w:id="7"/>
       <w:r>
         <w:rPr>
           <w:rFonts w:ascii="Google Sans Flex Medium" w:cs="Google Sans Flex Medium" w:eastAsia="Google Sans Flex Medium" w:hAnsi="Google Sans Flex Medium"/>
@@ -1181,6 +1183,7 @@
         </w:rPr>
         <w:t xml:space="preserve">2. Progressive enforcement - safe from day one</w:t>
       </w:r>
+      <w:bookmarkEnd w:id="7"/>
     </w:p>
     <w:p>
       <w:pPr>
@@ -1202,8 +1205,8 @@
       <w:r>
         <w:rPr>
           <w:rFonts w:ascii="Google Sans Flex Medium" w:cs="Google Sans Flex Medium" w:eastAsia="Google Sans Flex Medium" w:hAnsi="Google Sans Flex Medium"/>
-          <w:b/>
-          <w:bCs/>
+          <w:b w:val="false"/>
+          <w:bCs w:val="false"/>
           <w:i w:val="false"/>
           <w:iCs w:val="false"/>
           <w:color w:val="0f172a"/>
@@ -1246,8 +1249,8 @@
       <w:r>
         <w:rPr>
           <w:rFonts w:ascii="Google Sans Flex Medium" w:cs="Google Sans Flex Medium" w:eastAsia="Google Sans Flex Medium" w:hAnsi="Google Sans Flex Medium"/>
-          <w:b/>
-          <w:bCs/>
+          <w:b w:val="false"/>
+          <w:bCs w:val="false"/>
           <w:i w:val="false"/>
           <w:iCs w:val="false"/>
           <w:color w:val="0f172a"/>
@@ -1277,8 +1280,8 @@
       <w:r>
         <w:rPr>
           <w:rFonts w:ascii="Google Sans Flex Medium" w:cs="Google Sans Flex Medium" w:eastAsia="Google Sans Flex Medium" w:hAnsi="Google Sans Flex Medium"/>
-          <w:b/>
-          <w:bCs/>
+          <w:b w:val="false"/>
+          <w:bCs w:val="false"/>
           <w:i w:val="false"/>
           <w:iCs w:val="false"/>
           <w:color w:val="0f172a"/>
@@ -1307,6 +1310,7 @@
         <w:keepNext/>
         <w:spacing w:after="69" w:before="160" w:line="240" w:lineRule="auto"/>
       </w:pPr>
+      <w:bookmarkStart w:name="bm_8" w:id="8"/>
       <w:r>
         <w:rPr>
           <w:rFonts w:ascii="Google Sans Flex Medium" w:cs="Google Sans Flex Medium" w:eastAsia="Google Sans Flex Medium" w:hAnsi="Google Sans Flex Medium"/>
@@ -1318,8 +1322,9 @@
           <w:sz w:val="28"/>
           <w:szCs w:val="28"/>
         </w:rPr>
-        <w:t xml:space="preserve">3. Every rule is configurable - 60 of them</w:t>
-      </w:r>
+        <w:t xml:space="preserve">3. Sixty rules, 44 of them yours to configure</w:t>
+      </w:r>
+      <w:bookmarkEnd w:id="8"/>
     </w:p>
     <w:p>
       <w:pPr>
@@ -1336,13 +1341,13 @@
           <w:sz w:val="22"/>
           <w:szCs w:val="22"/>
         </w:rPr>
-        <w:t xml:space="preserve">Each rule is </w:t>
-      </w:r>
-      <w:r>
-        <w:rPr>
-          <w:rFonts w:ascii="Google Sans Flex Medium" w:cs="Google Sans Flex Medium" w:eastAsia="Google Sans Flex Medium" w:hAnsi="Google Sans Flex Medium"/>
-          <w:b/>
-          <w:bCs/>
+        <w:t xml:space="preserve">Each configurable rule is </w:t>
+      </w:r>
+      <w:r>
+        <w:rPr>
+          <w:rFonts w:ascii="Google Sans Flex Medium" w:cs="Google Sans Flex Medium" w:eastAsia="Google Sans Flex Medium" w:hAnsi="Google Sans Flex Medium"/>
+          <w:b w:val="false"/>
+          <w:bCs w:val="false"/>
           <w:i w:val="false"/>
           <w:iCs w:val="false"/>
           <w:color w:val="0f172a"/>
@@ -1367,8 +1372,8 @@
       <w:r>
         <w:rPr>
           <w:rFonts w:ascii="Google Sans Flex Medium" w:cs="Google Sans Flex Medium" w:eastAsia="Google Sans Flex Medium" w:hAnsi="Google Sans Flex Medium"/>
-          <w:b/>
-          <w:bCs/>
+          <w:b w:val="false"/>
+          <w:bCs w:val="false"/>
           <w:i w:val="false"/>
           <w:iCs w:val="false"/>
           <w:color w:val="0f172a"/>
@@ -1393,8 +1398,8 @@
       <w:r>
         <w:rPr>
           <w:rFonts w:ascii="Google Sans Flex Medium" w:cs="Google Sans Flex Medium" w:eastAsia="Google Sans Flex Medium" w:hAnsi="Google Sans Flex Medium"/>
-          <w:b/>
-          <w:bCs/>
+          <w:b w:val="false"/>
+          <w:bCs w:val="false"/>
           <w:i w:val="false"/>
           <w:iCs w:val="false"/>
           <w:color w:val="0f172a"/>
@@ -1414,19 +1419,19 @@
           <w:sz w:val="22"/>
           <w:szCs w:val="22"/>
         </w:rPr>
-        <w:t xml:space="preserve">, resolved through four layers:</w:t>
+        <w:t xml:space="preserve">, resolved through four layers (a further 16 integrity checks are fixed, because bypassing them would corrupt the ledger):</w:t>
       </w:r>
     </w:p>
     <w:tbl>
       <w:tblPr>
         <w:tblW w:type="dxa" w:w="9602"/>
         <w:tblBorders>
-          <w:top w:val="nil"/>
-          <w:left w:val="nil"/>
-          <w:bottom w:val="nil"/>
-          <w:right w:val="nil"/>
-          <w:insideH w:val="nil"/>
-          <w:insideV w:val="nil"/>
+          <w:top w:val="single" w:color="auto" w:sz="4"/>
+          <w:left w:val="single" w:color="auto" w:sz="4"/>
+          <w:bottom w:val="single" w:color="auto" w:sz="4"/>
+          <w:right w:val="single" w:color="auto" w:sz="4"/>
+          <w:insideH w:val="single" w:color="auto" w:sz="4"/>
+          <w:insideV w:val="single" w:color="auto" w:sz="4"/>
         </w:tblBorders>
         <w:tblLayout w:type="fixed"/>
       </w:tblPr>
@@ -1438,17 +1443,17 @@
           <w:tcPr>
             <w:tcW w:type="dxa" w:w="9602"/>
             <w:tcBorders>
-              <w:top w:val="nil"/>
-              <w:left w:val="single" w:color="3F7DDE" w:sz="24"/>
-              <w:bottom w:val="nil"/>
-              <w:right w:val="nil"/>
+              <w:top w:val="single" w:color="cccccc" w:sz="4"/>
+              <w:left w:val="single" w:color="cccccc" w:sz="4"/>
+              <w:bottom w:val="single" w:color="cccccc" w:sz="4"/>
+              <w:right w:val="single" w:color="cccccc" w:sz="4"/>
             </w:tcBorders>
-            <w:shd w:fill="f1f5f9" w:val="clear"/>
+            <w:shd w:fill="FAFAFA" w:color="auto" w:val="clear"/>
             <w:tcMar>
               <w:top w:type="dxa" w:w="144"/>
-              <w:left w:type="dxa" w:w="144"/>
+              <w:left w:type="dxa" w:w="216"/>
               <w:bottom w:type="dxa" w:w="144"/>
-              <w:right w:type="dxa" w:w="144"/>
+              <w:right w:type="dxa" w:w="216"/>
             </w:tcMar>
           </w:tcPr>
           <w:p>
@@ -1457,11 +1462,7 @@
             </w:pPr>
             <w:r>
               <w:rPr>
-                <w:rFonts w:ascii="Google Sans Flex Medium" w:cs="Google Sans Flex Medium" w:eastAsia="Google Sans Flex Medium" w:hAnsi="Google Sans Flex Medium"/>
-                <w:b w:val="false"/>
-                <w:bCs w:val="false"/>
-                <w:i w:val="false"/>
-                <w:iCs w:val="false"/>
+                <w:rFonts w:ascii="Courier New" w:cs="Courier New" w:eastAsia="Courier New" w:hAnsi="Courier New"/>
                 <w:color w:val="0f172a"/>
                 <w:sz w:val="18"/>
                 <w:szCs w:val="18"/>
@@ -1474,13 +1475,13 @@
     </w:tbl>
     <w:p>
       <w:pPr>
-        <w:spacing w:after="100" w:before="0" w:line="240" w:lineRule="auto"/>
-      </w:pPr>
-    </w:p>
-    <w:p>
-      <w:pPr>
         <w:spacing w:after="150" w:before="0" w:line="240" w:lineRule="auto"/>
       </w:pPr>
+    </w:p>
+    <w:p>
+      <w:pPr>
+        <w:spacing w:after="150" w:before="0" w:line="240" w:lineRule="auto"/>
+      </w:pPr>
       <w:r>
         <w:rPr>
           <w:rFonts w:ascii="Google Sans Flex Normal" w:cs="Google Sans Flex Normal" w:eastAsia="Google Sans Flex Normal" w:hAnsi="Google Sans Flex Normal"/>
@@ -1502,8 +1503,8 @@
       <w:r>
         <w:rPr>
           <w:rFonts w:ascii="Google Sans Flex Medium" w:cs="Google Sans Flex Medium" w:eastAsia="Google Sans Flex Medium" w:hAnsi="Google Sans Flex Medium"/>
-          <w:b/>
-          <w:bCs/>
+          <w:b w:val="false"/>
+          <w:bCs w:val="false"/>
           <w:i w:val="false"/>
           <w:iCs w:val="false"/>
           <w:color w:val="0f172a"/>
@@ -1532,6 +1533,7 @@
         <w:keepNext/>
         <w:spacing w:after="69" w:before="160" w:line="240" w:lineRule="auto"/>
       </w:pPr>
+      <w:bookmarkStart w:name="bm_9" w:id="9"/>
       <w:r>
         <w:rPr>
           <w:rFonts w:ascii="Google Sans Flex Medium" w:cs="Google Sans Flex Medium" w:eastAsia="Google Sans Flex Medium" w:hAnsi="Google Sans Flex Medium"/>
@@ -1545,6 +1547,7 @@
         </w:rPr>
         <w:t xml:space="preserve">4. Statutory compliance enforced at the gate</w:t>
       </w:r>
+      <w:bookmarkEnd w:id="9"/>
     </w:p>
     <w:p>
       <w:pPr>
@@ -1584,8 +1587,8 @@
       <w:r>
         <w:rPr>
           <w:rFonts w:ascii="Google Sans Flex Medium" w:cs="Google Sans Flex Medium" w:eastAsia="Google Sans Flex Medium" w:hAnsi="Google Sans Flex Medium"/>
-          <w:b/>
-          <w:bCs/>
+          <w:b w:val="false"/>
+          <w:bCs w:val="false"/>
           <w:i w:val="false"/>
           <w:iCs w:val="false"/>
           <w:color w:val="0f172a"/>
@@ -1605,7 +1608,7 @@
           <w:sz w:val="22"/>
           <w:szCs w:val="22"/>
         </w:rPr>
-        <w:t xml:space="preserve">: blocks dispatch until the E-Invoice (IRN) and E-Way Bill actually exist on the invoice. Thresholds are read live from GST Settings and the state-wise E-Way Bill master - never hard-coded, because the limits change and vary by state.</w:t>
+        <w:t xml:space="preserve"> (it needs the India Compliance app, and switches off cleanly when that app is absent): blocks dispatch until the E-Invoice (IRN) and E-Way Bill actually exist on the invoice. Thresholds are read live from GST Settings and the state-wise E-Way Bill master - never hard-coded, because the limits change and vary by state.</w:t>
       </w:r>
     </w:p>
     <w:p>
@@ -1654,8 +1657,8 @@
       <w:r>
         <w:rPr>
           <w:rFonts w:ascii="Google Sans Flex Medium" w:cs="Google Sans Flex Medium" w:eastAsia="Google Sans Flex Medium" w:hAnsi="Google Sans Flex Medium"/>
-          <w:b/>
-          <w:bCs/>
+          <w:b w:val="false"/>
+          <w:bCs w:val="false"/>
           <w:i w:val="false"/>
           <w:iCs w:val="false"/>
           <w:color w:val="0f172a"/>
@@ -1703,8 +1706,8 @@
       <w:r>
         <w:rPr>
           <w:rFonts w:ascii="Google Sans Flex Medium" w:cs="Google Sans Flex Medium" w:eastAsia="Google Sans Flex Medium" w:hAnsi="Google Sans Flex Medium"/>
-          <w:b/>
-          <w:bCs/>
+          <w:b w:val="false"/>
+          <w:bCs w:val="false"/>
           <w:i w:val="false"/>
           <w:iCs w:val="false"/>
           <w:color w:val="0f172a"/>
@@ -1733,6 +1736,7 @@
         <w:keepNext/>
         <w:spacing w:after="69" w:before="160" w:line="240" w:lineRule="auto"/>
       </w:pPr>
+      <w:bookmarkStart w:name="bm_10" w:id="10"/>
       <w:r>
         <w:rPr>
           <w:rFonts w:ascii="Google Sans Flex Medium" w:cs="Google Sans Flex Medium" w:eastAsia="Google Sans Flex Medium" w:hAnsi="Google Sans Flex Medium"/>
@@ -1746,6 +1750,7 @@
         </w:rPr>
         <w:t xml:space="preserve">5. A consumption ledger that survives reality</w:t>
       </w:r>
+      <w:bookmarkEnd w:id="10"/>
     </w:p>
     <w:p>
       <w:pPr>
@@ -1790,8 +1795,8 @@
       <w:r>
         <w:rPr>
           <w:rFonts w:ascii="Google Sans Flex Medium" w:cs="Google Sans Flex Medium" w:eastAsia="Google Sans Flex Medium" w:hAnsi="Google Sans Flex Medium"/>
-          <w:b/>
-          <w:bCs/>
+          <w:b w:val="false"/>
+          <w:bCs w:val="false"/>
           <w:i w:val="false"/>
           <w:iCs w:val="false"/>
           <w:color w:val="0f172a"/>
@@ -1820,6 +1825,7 @@
         <w:keepNext/>
         <w:spacing w:after="69" w:before="160" w:line="240" w:lineRule="auto"/>
       </w:pPr>
+      <w:bookmarkStart w:name="bm_11" w:id="11"/>
       <w:r>
         <w:rPr>
           <w:rFonts w:ascii="Google Sans Flex Medium" w:cs="Google Sans Flex Medium" w:eastAsia="Google Sans Flex Medium" w:hAnsi="Google Sans Flex Medium"/>
@@ -1833,6 +1839,7 @@
         </w:rPr>
         <w:t xml:space="preserve">6. Discrepancy captured where it is discovered</w:t>
       </w:r>
+      <w:bookmarkEnd w:id="11"/>
     </w:p>
     <w:p>
       <w:pPr>
@@ -1854,8 +1861,8 @@
       <w:r>
         <w:rPr>
           <w:rFonts w:ascii="Google Sans Flex Medium" w:cs="Google Sans Flex Medium" w:eastAsia="Google Sans Flex Medium" w:hAnsi="Google Sans Flex Medium"/>
-          <w:b/>
-          <w:bCs/>
+          <w:b w:val="false"/>
+          <w:bCs w:val="false"/>
           <w:i w:val="false"/>
           <w:iCs w:val="false"/>
           <w:color w:val="0f172a"/>
@@ -1885,8 +1892,8 @@
       <w:r>
         <w:rPr>
           <w:rFonts w:ascii="Google Sans Flex Medium" w:cs="Google Sans Flex Medium" w:eastAsia="Google Sans Flex Medium" w:hAnsi="Google Sans Flex Medium"/>
-          <w:b/>
-          <w:bCs/>
+          <w:b w:val="false"/>
+          <w:bCs w:val="false"/>
           <w:i w:val="false"/>
           <w:iCs w:val="false"/>
           <w:color w:val="0f172a"/>
@@ -1906,7 +1913,7 @@
           <w:sz w:val="22"/>
           <w:szCs w:val="22"/>
         </w:rPr>
-        <w:t xml:space="preserve">, not the paperwork quantity, is what flows into the Purchase Receipt. Damaged quantity maps to rejected quantity with a rejected warehouse, automatically.</w:t>
+        <w:t xml:space="preserve">, not the paperwork quantity, is what flows into the Purchase Receipt. Damaged goods and goods rejected at the gate map to rejected quantity with a rejected warehouse, automatically. Whether a counted shortage is also booked as rejected stock is a setting you choose: by default short goods are simply not received, so the order line stays open.</w:t>
       </w:r>
     </w:p>
     <w:p>
@@ -1934,8 +1941,8 @@
       <w:r>
         <w:rPr>
           <w:rFonts w:ascii="Google Sans Flex Medium" w:cs="Google Sans Flex Medium" w:eastAsia="Google Sans Flex Medium" w:hAnsi="Google Sans Flex Medium"/>
-          <w:b/>
-          <w:bCs/>
+          <w:b w:val="false"/>
+          <w:bCs w:val="false"/>
           <w:i w:val="false"/>
           <w:iCs w:val="false"/>
           <w:color w:val="0f172a"/>
@@ -1964,6 +1971,7 @@
         <w:keepNext/>
         <w:spacing w:after="69" w:before="160" w:line="240" w:lineRule="auto"/>
       </w:pPr>
+      <w:bookmarkStart w:name="bm_12" w:id="12"/>
       <w:r>
         <w:rPr>
           <w:rFonts w:ascii="Google Sans Flex Medium" w:cs="Google Sans Flex Medium" w:eastAsia="Google Sans Flex Medium" w:hAnsi="Google Sans Flex Medium"/>
@@ -1977,6 +1985,7 @@
         </w:rPr>
         <w:t xml:space="preserve">7. Auto-created draft gate passes</w:t>
       </w:r>
+      <w:bookmarkEnd w:id="12"/>
     </w:p>
     <w:p>
       <w:pPr>
@@ -2003,8 +2012,8 @@
       <w:r>
         <w:rPr>
           <w:rFonts w:ascii="Google Sans Flex Medium" w:cs="Google Sans Flex Medium" w:eastAsia="Google Sans Flex Medium" w:hAnsi="Google Sans Flex Medium"/>
-          <w:b/>
-          <w:bCs/>
+          <w:b w:val="false"/>
+          <w:bCs w:val="false"/>
           <w:i w:val="false"/>
           <w:iCs w:val="false"/>
           <w:color w:val="0f172a"/>
@@ -2085,6 +2094,7 @@
         <w:keepNext/>
         <w:spacing w:after="69" w:before="160" w:line="240" w:lineRule="auto"/>
       </w:pPr>
+      <w:bookmarkStart w:name="bm_13" w:id="13"/>
       <w:r>
         <w:rPr>
           <w:rFonts w:ascii="Google Sans Flex Medium" w:cs="Google Sans Flex Medium" w:eastAsia="Google Sans Flex Medium" w:hAnsi="Google Sans Flex Medium"/>
@@ -2098,6 +2108,7 @@
         </w:rPr>
         <w:t xml:space="preserve">8. Quantity policy per flow</w:t>
       </w:r>
+      <w:bookmarkEnd w:id="13"/>
     </w:p>
     <w:p>
       <w:pPr>
@@ -2119,8 +2130,8 @@
       <w:r>
         <w:rPr>
           <w:rFonts w:ascii="Google Sans Flex Medium" w:cs="Google Sans Flex Medium" w:eastAsia="Google Sans Flex Medium" w:hAnsi="Google Sans Flex Medium"/>
-          <w:b/>
-          <w:bCs/>
+          <w:b w:val="false"/>
+          <w:bCs w:val="false"/>
           <w:i w:val="false"/>
           <w:iCs w:val="false"/>
           <w:color w:val="0f172a"/>
@@ -2145,8 +2156,8 @@
       <w:r>
         <w:rPr>
           <w:rFonts w:ascii="Google Sans Flex Medium" w:cs="Google Sans Flex Medium" w:eastAsia="Google Sans Flex Medium" w:hAnsi="Google Sans Flex Medium"/>
-          <w:b/>
-          <w:bCs/>
+          <w:b w:val="false"/>
+          <w:bCs w:val="false"/>
           <w:i w:val="false"/>
           <w:iCs w:val="false"/>
           <w:color w:val="0f172a"/>
@@ -2176,8 +2187,8 @@
       <w:r>
         <w:rPr>
           <w:rFonts w:ascii="Google Sans Flex Medium" w:cs="Google Sans Flex Medium" w:eastAsia="Google Sans Flex Medium" w:hAnsi="Google Sans Flex Medium"/>
-          <w:b/>
-          <w:bCs/>
+          <w:b w:val="false"/>
+          <w:bCs w:val="false"/>
           <w:i w:val="false"/>
           <w:iCs w:val="false"/>
           <w:color w:val="0f172a"/>
@@ -2206,6 +2217,7 @@
         <w:keepNext/>
         <w:spacing w:after="69" w:before="160" w:line="240" w:lineRule="auto"/>
       </w:pPr>
+      <w:bookmarkStart w:name="bm_14" w:id="14"/>
       <w:r>
         <w:rPr>
           <w:rFonts w:ascii="Google Sans Flex Medium" w:cs="Google Sans Flex Medium" w:eastAsia="Google Sans Flex Medium" w:hAnsi="Google Sans Flex Medium"/>
@@ -2219,6 +2231,7 @@
         </w:rPr>
         <w:t xml:space="preserve">9. Audit trail that cannot be edited</w:t>
       </w:r>
+      <w:bookmarkEnd w:id="14"/>
     </w:p>
     <w:p>
       <w:pPr>
@@ -2240,8 +2253,8 @@
       <w:r>
         <w:rPr>
           <w:rFonts w:ascii="Google Sans Flex Medium" w:cs="Google Sans Flex Medium" w:eastAsia="Google Sans Flex Medium" w:hAnsi="Google Sans Flex Medium"/>
-          <w:b/>
-          <w:bCs/>
+          <w:b w:val="false"/>
+          <w:bCs w:val="false"/>
           <w:i w:val="false"/>
           <w:iCs w:val="false"/>
           <w:color w:val="0f172a"/>
@@ -2289,8 +2302,8 @@
       <w:r>
         <w:rPr>
           <w:rFonts w:ascii="Google Sans Flex Medium" w:cs="Google Sans Flex Medium" w:eastAsia="Google Sans Flex Medium" w:hAnsi="Google Sans Flex Medium"/>
-          <w:b/>
-          <w:bCs/>
+          <w:b w:val="false"/>
+          <w:bCs w:val="false"/>
           <w:i w:val="false"/>
           <w:iCs w:val="false"/>
           <w:color w:val="0f172a"/>
@@ -2319,6 +2332,7 @@
         <w:keepNext/>
         <w:spacing w:after="69" w:before="160" w:line="240" w:lineRule="auto"/>
       </w:pPr>
+      <w:bookmarkStart w:name="bm_15" w:id="15"/>
       <w:r>
         <w:rPr>
           <w:rFonts w:ascii="Google Sans Flex Medium" w:cs="Google Sans Flex Medium" w:eastAsia="Google Sans Flex Medium" w:hAnsi="Google Sans Flex Medium"/>
@@ -2332,6 +2346,7 @@
         </w:rPr>
         <w:t xml:space="preserve">10. Real observability</w:t>
       </w:r>
+      <w:bookmarkEnd w:id="15"/>
     </w:p>
     <w:p>
       <w:pPr>
@@ -2353,8 +2368,8 @@
       <w:r>
         <w:rPr>
           <w:rFonts w:ascii="Google Sans Flex Medium" w:cs="Google Sans Flex Medium" w:eastAsia="Google Sans Flex Medium" w:hAnsi="Google Sans Flex Medium"/>
-          <w:b/>
-          <w:bCs/>
+          <w:b w:val="false"/>
+          <w:bCs w:val="false"/>
           <w:i w:val="false"/>
           <w:iCs w:val="false"/>
           <w:color w:val="0f172a"/>
@@ -2402,8 +2417,8 @@
       <w:r>
         <w:rPr>
           <w:rFonts w:ascii="Google Sans Flex Medium" w:cs="Google Sans Flex Medium" w:eastAsia="Google Sans Flex Medium" w:hAnsi="Google Sans Flex Medium"/>
-          <w:b/>
-          <w:bCs/>
+          <w:b w:val="false"/>
+          <w:bCs w:val="false"/>
           <w:i w:val="false"/>
           <w:iCs w:val="false"/>
           <w:color w:val="0f172a"/>
@@ -2432,6 +2447,7 @@
         <w:keepNext/>
         <w:spacing w:after="92" w:before="200" w:line="240" w:lineRule="auto"/>
       </w:pPr>
+      <w:bookmarkStart w:name="bm_16" w:id="16"/>
       <w:r>
         <w:rPr>
           <w:rFonts w:ascii="Google Sans Flex Medium" w:cs="Google Sans Flex Medium" w:eastAsia="Google Sans Flex Medium" w:hAnsi="Google Sans Flex Medium"/>
@@ -2445,6 +2461,7 @@
         </w:rPr>
         <w:t xml:space="preserve">Feature inventory</w:t>
       </w:r>
+      <w:bookmarkEnd w:id="16"/>
     </w:p>
     <w:p>
       <w:pPr>
@@ -2452,6 +2469,7 @@
         <w:keepNext/>
         <w:spacing w:after="69" w:before="160" w:line="240" w:lineRule="auto"/>
       </w:pPr>
+      <w:bookmarkStart w:name="bm_17" w:id="17"/>
       <w:r>
         <w:rPr>
           <w:rFonts w:ascii="Google Sans Flex Medium" w:cs="Google Sans Flex Medium" w:eastAsia="Google Sans Flex Medium" w:hAnsi="Google Sans Flex Medium"/>
@@ -2465,6 +2483,7 @@
         </w:rPr>
         <w:t xml:space="preserve">Gate pass document</w:t>
       </w:r>
+      <w:bookmarkEnd w:id="17"/>
     </w:p>
     <w:p>
       <w:pPr>
@@ -2473,7 +2492,7 @@
           <w:ilvl w:val="0"/>
           <w:numId w:val="2"/>
         </w:numPr>
-        <w:spacing w:after="60" w:before="80" w:line="240" w:lineRule="auto"/>
+        <w:spacing w:after="40" w:before="80" w:line="240" w:lineRule="auto"/>
       </w:pPr>
       <w:r>
         <w:rPr>
@@ -2496,7 +2515,7 @@
           <w:ilvl w:val="0"/>
           <w:numId w:val="2"/>
         </w:numPr>
-        <w:spacing w:after="60" w:before="80" w:line="240" w:lineRule="auto"/>
+        <w:spacing w:after="40" w:before="80" w:line="240" w:lineRule="auto"/>
       </w:pPr>
       <w:r>
         <w:rPr>
@@ -2519,7 +2538,7 @@
           <w:ilvl w:val="0"/>
           <w:numId w:val="2"/>
         </w:numPr>
-        <w:spacing w:after="60" w:before="80" w:line="240" w:lineRule="auto"/>
+        <w:spacing w:after="40" w:before="80" w:line="240" w:lineRule="auto"/>
       </w:pPr>
       <w:r>
         <w:rPr>
@@ -2542,7 +2561,7 @@
           <w:ilvl w:val="0"/>
           <w:numId w:val="2"/>
         </w:numPr>
-        <w:spacing w:after="60" w:before="80" w:line="240" w:lineRule="auto"/>
+        <w:spacing w:after="40" w:before="80" w:line="240" w:lineRule="auto"/>
       </w:pPr>
       <w:r>
         <w:rPr>
@@ -2565,7 +2584,7 @@
           <w:ilvl w:val="0"/>
           <w:numId w:val="2"/>
         </w:numPr>
-        <w:spacing w:after="60" w:before="80" w:line="240" w:lineRule="auto"/>
+        <w:spacing w:after="40" w:before="80" w:line="240" w:lineRule="auto"/>
       </w:pPr>
       <w:r>
         <w:rPr>
@@ -2588,7 +2607,7 @@
           <w:ilvl w:val="0"/>
           <w:numId w:val="2"/>
         </w:numPr>
-        <w:spacing w:after="60" w:before="80" w:line="240" w:lineRule="auto"/>
+        <w:spacing w:after="40" w:before="80" w:line="240" w:lineRule="auto"/>
       </w:pPr>
       <w:r>
         <w:rPr>
@@ -2611,7 +2630,7 @@
           <w:ilvl w:val="0"/>
           <w:numId w:val="2"/>
         </w:numPr>
-        <w:spacing w:after="60" w:before="80" w:line="240" w:lineRule="auto"/>
+        <w:spacing w:after="40" w:before="80" w:line="240" w:lineRule="auto"/>
       </w:pPr>
       <w:r>
         <w:rPr>
@@ -2634,7 +2653,7 @@
           <w:ilvl w:val="0"/>
           <w:numId w:val="2"/>
         </w:numPr>
-        <w:spacing w:after="60" w:before="80" w:line="240" w:lineRule="auto"/>
+        <w:spacing w:after="40" w:before="80" w:line="240" w:lineRule="auto"/>
       </w:pPr>
       <w:r>
         <w:rPr>
@@ -2657,7 +2676,7 @@
           <w:ilvl w:val="0"/>
           <w:numId w:val="2"/>
         </w:numPr>
-        <w:spacing w:after="60" w:before="80" w:line="240" w:lineRule="auto"/>
+        <w:spacing w:after="40" w:before="80" w:line="240" w:lineRule="auto"/>
       </w:pPr>
       <w:r>
         <w:rPr>
@@ -2680,7 +2699,7 @@
           <w:ilvl w:val="0"/>
           <w:numId w:val="2"/>
         </w:numPr>
-        <w:spacing w:after="60" w:before="80" w:line="240" w:lineRule="auto"/>
+        <w:spacing w:after="40" w:before="80" w:line="240" w:lineRule="auto"/>
       </w:pPr>
       <w:r>
         <w:rPr>
@@ -2703,7 +2722,7 @@
           <w:ilvl w:val="0"/>
           <w:numId w:val="2"/>
         </w:numPr>
-        <w:spacing w:after="60" w:before="80" w:line="240" w:lineRule="auto"/>
+        <w:spacing w:after="40" w:before="80" w:line="240" w:lineRule="auto"/>
       </w:pPr>
       <w:r>
         <w:rPr>
@@ -2716,148 +2735,7 @@
           <w:sz w:val="20"/>
           <w:szCs w:val="20"/>
         </w:rPr>
-        <w:t xml:space="preserve">Tracking ID from a Jinja template, rendered once at creation and then frozen</w:t>
-      </w:r>
-    </w:p>
-    <w:p>
-      <w:pPr>
-        <w:pStyle w:val="Heading3"/>
-        <w:keepNext/>
-        <w:spacing w:after="69" w:before="160" w:line="240" w:lineRule="auto"/>
-      </w:pPr>
-      <w:r>
-        <w:rPr>
-          <w:rFonts w:ascii="Google Sans Flex Medium" w:cs="Google Sans Flex Medium" w:eastAsia="Google Sans Flex Medium" w:hAnsi="Google Sans Flex Medium"/>
-          <w:b/>
-          <w:bCs/>
-          <w:i w:val="false"/>
-          <w:iCs w:val="false"/>
-          <w:color w:val="437FDB"/>
-          <w:sz w:val="28"/>
-          <w:szCs w:val="28"/>
-        </w:rPr>
-        <w:t xml:space="preserve">Source flows - twelve shipped, unlimited configurable</w:t>
-      </w:r>
-    </w:p>
-    <w:p>
-      <w:pPr>
-        <w:spacing w:after="150" w:before="0" w:line="240" w:lineRule="auto"/>
-      </w:pPr>
-      <w:r>
-        <w:rPr>
-          <w:rFonts w:ascii="Google Sans Flex Normal" w:cs="Google Sans Flex Normal" w:eastAsia="Google Sans Flex Normal" w:hAnsi="Google Sans Flex Normal"/>
-          <w:b w:val="false"/>
-          <w:bCs w:val="false"/>
-          <w:i w:val="false"/>
-          <w:iCs w:val="false"/>
-          <w:color w:val="0f172a"/>
-          <w:sz w:val="22"/>
-          <w:szCs w:val="22"/>
-        </w:rPr>
-        <w:t xml:space="preserve">Purchase Order · Subcontracting Order (finished goods) · Subcontracting Order (raw material out) · Stock Entry (send to subcontractor) · Stock Entry (transit out) · Stock Entry (transit in) · </w:t>
-      </w:r>
-      <w:r>
-        <w:rPr>
-          <w:rFonts w:ascii="Google Sans Flex Medium" w:cs="Google Sans Flex Medium" w:eastAsia="Google Sans Flex Medium" w:hAnsi="Google Sans Flex Medium"/>
-          <w:b/>
-          <w:bCs/>
-          <w:i w:val="false"/>
-          <w:iCs w:val="false"/>
-          <w:color w:val="0f172a"/>
-          <w:sz w:val="22"/>
-          <w:szCs w:val="22"/>
-        </w:rPr>
-        <w:t xml:space="preserve">Stock Entry (manual return, before any return entry exists)</w:t>
-      </w:r>
-      <w:r>
-        <w:rPr>
-          <w:rFonts w:ascii="Google Sans Flex Normal" w:cs="Google Sans Flex Normal" w:eastAsia="Google Sans Flex Normal" w:hAnsi="Google Sans Flex Normal"/>
-          <w:b w:val="false"/>
-          <w:bCs w:val="false"/>
-          <w:i w:val="false"/>
-          <w:iCs w:val="false"/>
-          <w:color w:val="0f172a"/>
-          <w:sz w:val="22"/>
-          <w:szCs w:val="22"/>
-        </w:rPr>
-        <w:t xml:space="preserve"> · Purchase Receipt return · Subcontracting Receipt return · </w:t>
-      </w:r>
-      <w:r>
-        <w:rPr>
-          <w:rFonts w:ascii="Google Sans Flex Medium" w:cs="Google Sans Flex Medium" w:eastAsia="Google Sans Flex Medium" w:hAnsi="Google Sans Flex Medium"/>
-          <w:b/>
-          <w:bCs/>
-          <w:i w:val="false"/>
-          <w:iCs w:val="false"/>
-          <w:color w:val="0f172a"/>
-          <w:sz w:val="22"/>
-          <w:szCs w:val="22"/>
-        </w:rPr>
-        <w:t xml:space="preserve">Sales Invoice</w:t>
-      </w:r>
-      <w:r>
-        <w:rPr>
-          <w:rFonts w:ascii="Google Sans Flex Normal" w:cs="Google Sans Flex Normal" w:eastAsia="Google Sans Flex Normal" w:hAnsi="Google Sans Flex Normal"/>
-          <w:b w:val="false"/>
-          <w:bCs w:val="false"/>
-          <w:i w:val="false"/>
-          <w:iCs w:val="false"/>
-          <w:color w:val="0f172a"/>
-          <w:sz w:val="22"/>
-          <w:szCs w:val="22"/>
-        </w:rPr>
-        <w:t xml:space="preserve"> · Delivery Note · </w:t>
-      </w:r>
-      <w:r>
-        <w:rPr>
-          <w:rFonts w:ascii="Google Sans Flex Medium" w:cs="Google Sans Flex Medium" w:eastAsia="Google Sans Flex Medium" w:hAnsi="Google Sans Flex Medium"/>
-          <w:b/>
-          <w:bCs/>
-          <w:i w:val="false"/>
-          <w:iCs w:val="false"/>
-          <w:color w:val="0f172a"/>
-          <w:sz w:val="22"/>
-          <w:szCs w:val="22"/>
-        </w:rPr>
-        <w:t xml:space="preserve">Gate Pass return leg</w:t>
-      </w:r>
-    </w:p>
-    <w:p>
-      <w:pPr>
-        <w:spacing w:after="150" w:before="0" w:line="240" w:lineRule="auto"/>
-      </w:pPr>
-      <w:r>
-        <w:rPr>
-          <w:rFonts w:ascii="Google Sans Flex Normal" w:cs="Google Sans Flex Normal" w:eastAsia="Google Sans Flex Normal" w:hAnsi="Google Sans Flex Normal"/>
-          <w:b w:val="false"/>
-          <w:bCs w:val="false"/>
-          <w:i w:val="false"/>
-          <w:iCs w:val="false"/>
-          <w:color w:val="0f172a"/>
-          <w:sz w:val="22"/>
-          <w:szCs w:val="22"/>
-        </w:rPr>
-        <w:t xml:space="preserve">Each flow configures: child table, item/qty/UOM/rate/warehouse/BOM fields, pending formula, allowed statuses, party resolution with one level of indirection, selection filters, permitted roles, quantity policy, over-quantity allowance, target document and creation mode, required documents, compliance checks, and rule overrides.</w:t>
-      </w:r>
-    </w:p>
-    <w:p>
-      <w:pPr>
-        <w:pStyle w:val="Heading3"/>
-        <w:keepNext/>
-        <w:spacing w:after="69" w:before="160" w:line="240" w:lineRule="auto"/>
-      </w:pPr>
-      <w:r>
-        <w:rPr>
-          <w:rFonts w:ascii="Google Sans Flex Medium" w:cs="Google Sans Flex Medium" w:eastAsia="Google Sans Flex Medium" w:hAnsi="Google Sans Flex Medium"/>
-          <w:b/>
-          <w:bCs/>
-          <w:i w:val="false"/>
-          <w:iCs w:val="false"/>
-          <w:color w:val="437FDB"/>
-          <w:sz w:val="28"/>
-          <w:szCs w:val="28"/>
-        </w:rPr>
-        <w:t xml:space="preserve">Target documents</w:t>
+        <w:t xml:space="preserve">Several documents from one party on a single pass, with a list of them and a one-click remove while a draft; a different party or a repeated document is refused</w:t>
       </w:r>
     </w:p>
     <w:p>
@@ -2867,7 +2745,7 @@
           <w:ilvl w:val="0"/>
           <w:numId w:val="2"/>
         </w:numPr>
-        <w:spacing w:after="60" w:before="80" w:line="240" w:lineRule="auto"/>
+        <w:spacing w:after="40" w:before="80" w:line="240" w:lineRule="auto"/>
       </w:pPr>
       <w:r>
         <w:rPr>
@@ -2880,7 +2758,7 @@
           <w:sz w:val="20"/>
           <w:szCs w:val="20"/>
         </w:rPr>
-        <w:t xml:space="preserve">Purchase Receipt, Subcontracting Receipt, Stock Entry, Delivery Note</w:t>
+        <w:t xml:space="preserve">A picker that offers only what still has something left to pass</w:t>
       </w:r>
     </w:p>
     <w:p>
@@ -2890,7 +2768,7 @@
           <w:ilvl w:val="0"/>
           <w:numId w:val="2"/>
         </w:numPr>
-        <w:spacing w:after="60" w:before="80" w:line="240" w:lineRule="auto"/>
+        <w:spacing w:after="40" w:before="80" w:line="240" w:lineRule="auto"/>
       </w:pPr>
       <w:r>
         <w:rPr>
@@ -2903,7 +2781,7 @@
           <w:sz w:val="20"/>
           <w:szCs w:val="20"/>
         </w:rPr>
-        <w:t xml:space="preserve">Auto on submit, manual button, or pulled from the target's own form</w:t>
+        <w:t xml:space="preserve">Fifteen ready-made purposes, offered only for the direction they fit, each pre-filling its usual pass type</w:t>
       </w:r>
     </w:p>
     <w:p>
@@ -2913,7 +2791,7 @@
           <w:ilvl w:val="0"/>
           <w:numId w:val="2"/>
         </w:numPr>
-        <w:spacing w:after="60" w:before="80" w:line="240" w:lineRule="auto"/>
+        <w:spacing w:after="40" w:before="80" w:line="240" w:lineRule="auto"/>
       </w:pPr>
       <w:r>
         <w:rPr>
@@ -2926,7 +2804,7 @@
           <w:sz w:val="20"/>
           <w:szCs w:val="20"/>
         </w:rPr>
-        <w:t xml:space="preserve">Uses ERPNext's own mappers, so taxes, currency, terms and company defaults come along</w:t>
+        <w:t xml:space="preserve">Party address and contact limited to the chosen party, with the contact's mobile filled in</w:t>
       </w:r>
     </w:p>
     <w:p>
@@ -2936,7 +2814,7 @@
           <w:ilvl w:val="0"/>
           <w:numId w:val="2"/>
         </w:numPr>
-        <w:spacing w:after="60" w:before="80" w:line="240" w:lineRule="auto"/>
+        <w:spacing w:after="40" w:before="80" w:line="240" w:lineRule="auto"/>
       </w:pPr>
       <w:r>
         <w:rPr>
@@ -2949,7 +2827,7 @@
           <w:sz w:val="20"/>
           <w:szCs w:val="20"/>
         </w:rPr>
-        <w:t xml:space="preserve">Idempotent - a double click produces one receipt and a clear message</w:t>
+        <w:t xml:space="preserve">Allowed party types, and a separate numbering series for inward and outward passes</w:t>
       </w:r>
     </w:p>
     <w:p>
@@ -2959,7 +2837,7 @@
           <w:ilvl w:val="0"/>
           <w:numId w:val="2"/>
         </w:numPr>
-        <w:spacing w:after="60" w:before="80" w:line="240" w:lineRule="auto"/>
+        <w:spacing w:after="40" w:before="80" w:line="240" w:lineRule="auto"/>
       </w:pPr>
       <w:r>
         <w:rPr>
@@ -2972,8 +2850,180 @@
           <w:sz w:val="20"/>
           <w:szCs w:val="20"/>
         </w:rPr>
-        <w:t xml:space="preserve">Savepoint per target: one failure rolls back only that target, and is reported</w:t>
-      </w:r>
+        <w:t xml:space="preserve">Tracking ID from a placeholder template (</w:t>
+      </w:r>
+      <w:r>
+        <w:rPr>
+          <w:rFonts w:ascii="Courier New" w:cs="Courier New" w:eastAsia="Courier New" w:hAnsi="Courier New"/>
+          <w:color w:val="0f172a"/>
+          <w:sz w:val="18"/>
+          <w:szCs w:val="18"/>
+        </w:rPr>
+        <w:t xml:space="preserve">{{ party_code }}/{{ reference_no }}</w:t>
+      </w:r>
+      <w:r>
+        <w:rPr>
+          <w:rFonts w:ascii="Google Sans Flex Normal" w:cs="Google Sans Flex Normal" w:eastAsia="Google Sans Flex Normal" w:hAnsi="Google Sans Flex Normal"/>
+          <w:b w:val="false"/>
+          <w:bCs w:val="false"/>
+          <w:i w:val="false"/>
+          <w:iCs w:val="false"/>
+          <w:color w:val="0f172a"/>
+          <w:sz w:val="20"/>
+          <w:szCs w:val="20"/>
+        </w:rPr>
+        <w:t xml:space="preserve">), rendered once at creation and then frozen</w:t>
+      </w:r>
+    </w:p>
+    <w:p>
+      <w:pPr>
+        <w:spacing w:after="60" w:before="0" w:line="240" w:lineRule="auto"/>
+      </w:pPr>
+    </w:p>
+    <w:p>
+      <w:pPr>
+        <w:pStyle w:val="Heading3"/>
+        <w:keepNext/>
+        <w:spacing w:after="69" w:before="160" w:line="240" w:lineRule="auto"/>
+      </w:pPr>
+      <w:bookmarkStart w:name="bm_18" w:id="18"/>
+      <w:r>
+        <w:rPr>
+          <w:rFonts w:ascii="Google Sans Flex Medium" w:cs="Google Sans Flex Medium" w:eastAsia="Google Sans Flex Medium" w:hAnsi="Google Sans Flex Medium"/>
+          <w:b/>
+          <w:bCs/>
+          <w:i w:val="false"/>
+          <w:iCs w:val="false"/>
+          <w:color w:val="437FDB"/>
+          <w:sz w:val="28"/>
+          <w:szCs w:val="28"/>
+        </w:rPr>
+        <w:t xml:space="preserve">Source flows - twelve shipped, unlimited configurable</w:t>
+      </w:r>
+      <w:bookmarkEnd w:id="18"/>
+    </w:p>
+    <w:p>
+      <w:pPr>
+        <w:spacing w:after="150" w:before="0" w:line="240" w:lineRule="auto"/>
+      </w:pPr>
+      <w:r>
+        <w:rPr>
+          <w:rFonts w:ascii="Google Sans Flex Normal" w:cs="Google Sans Flex Normal" w:eastAsia="Google Sans Flex Normal" w:hAnsi="Google Sans Flex Normal"/>
+          <w:b w:val="false"/>
+          <w:bCs w:val="false"/>
+          <w:i w:val="false"/>
+          <w:iCs w:val="false"/>
+          <w:color w:val="0f172a"/>
+          <w:sz w:val="22"/>
+          <w:szCs w:val="22"/>
+        </w:rPr>
+        <w:t xml:space="preserve">Purchase Order · Subcontracting Order (finished goods) · Subcontracting Order (raw material out) · Stock Entry (send to subcontractor) · Stock Entry (transit out) · Stock Entry (transit in) · </w:t>
+      </w:r>
+      <w:r>
+        <w:rPr>
+          <w:rFonts w:ascii="Google Sans Flex Medium" w:cs="Google Sans Flex Medium" w:eastAsia="Google Sans Flex Medium" w:hAnsi="Google Sans Flex Medium"/>
+          <w:b w:val="false"/>
+          <w:bCs w:val="false"/>
+          <w:i w:val="false"/>
+          <w:iCs w:val="false"/>
+          <w:color w:val="0f172a"/>
+          <w:sz w:val="22"/>
+          <w:szCs w:val="22"/>
+        </w:rPr>
+        <w:t xml:space="preserve">Stock Entry (manual return, before any return entry exists)</w:t>
+      </w:r>
+      <w:r>
+        <w:rPr>
+          <w:rFonts w:ascii="Google Sans Flex Normal" w:cs="Google Sans Flex Normal" w:eastAsia="Google Sans Flex Normal" w:hAnsi="Google Sans Flex Normal"/>
+          <w:b w:val="false"/>
+          <w:bCs w:val="false"/>
+          <w:i w:val="false"/>
+          <w:iCs w:val="false"/>
+          <w:color w:val="0f172a"/>
+          <w:sz w:val="22"/>
+          <w:szCs w:val="22"/>
+        </w:rPr>
+        <w:t xml:space="preserve"> · Purchase Receipt return · Subcontracting Receipt return · </w:t>
+      </w:r>
+      <w:r>
+        <w:rPr>
+          <w:rFonts w:ascii="Google Sans Flex Medium" w:cs="Google Sans Flex Medium" w:eastAsia="Google Sans Flex Medium" w:hAnsi="Google Sans Flex Medium"/>
+          <w:b w:val="false"/>
+          <w:bCs w:val="false"/>
+          <w:i w:val="false"/>
+          <w:iCs w:val="false"/>
+          <w:color w:val="0f172a"/>
+          <w:sz w:val="22"/>
+          <w:szCs w:val="22"/>
+        </w:rPr>
+        <w:t xml:space="preserve">Sales Invoice</w:t>
+      </w:r>
+      <w:r>
+        <w:rPr>
+          <w:rFonts w:ascii="Google Sans Flex Normal" w:cs="Google Sans Flex Normal" w:eastAsia="Google Sans Flex Normal" w:hAnsi="Google Sans Flex Normal"/>
+          <w:b w:val="false"/>
+          <w:bCs w:val="false"/>
+          <w:i w:val="false"/>
+          <w:iCs w:val="false"/>
+          <w:color w:val="0f172a"/>
+          <w:sz w:val="22"/>
+          <w:szCs w:val="22"/>
+        </w:rPr>
+        <w:t xml:space="preserve"> · Delivery Note · </w:t>
+      </w:r>
+      <w:r>
+        <w:rPr>
+          <w:rFonts w:ascii="Google Sans Flex Medium" w:cs="Google Sans Flex Medium" w:eastAsia="Google Sans Flex Medium" w:hAnsi="Google Sans Flex Medium"/>
+          <w:b w:val="false"/>
+          <w:bCs w:val="false"/>
+          <w:i w:val="false"/>
+          <w:iCs w:val="false"/>
+          <w:color w:val="0f172a"/>
+          <w:sz w:val="22"/>
+          <w:szCs w:val="22"/>
+        </w:rPr>
+        <w:t xml:space="preserve">Gate Pass return leg</w:t>
+      </w:r>
+    </w:p>
+    <w:p>
+      <w:pPr>
+        <w:spacing w:after="150" w:before="0" w:line="240" w:lineRule="auto"/>
+      </w:pPr>
+      <w:r>
+        <w:rPr>
+          <w:rFonts w:ascii="Google Sans Flex Normal" w:cs="Google Sans Flex Normal" w:eastAsia="Google Sans Flex Normal" w:hAnsi="Google Sans Flex Normal"/>
+          <w:b w:val="false"/>
+          <w:bCs w:val="false"/>
+          <w:i w:val="false"/>
+          <w:iCs w:val="false"/>
+          <w:color w:val="0f172a"/>
+          <w:sz w:val="22"/>
+          <w:szCs w:val="22"/>
+        </w:rPr>
+        <w:t xml:space="preserve">Each flow configures: child table, item/qty/UOM/rate/warehouse/BOM fields, pending formula, allowed statuses, party resolution with one level of indirection, selection filters, permitted roles, quantity policy, over-quantity allowance, target document and creation mode, required documents, compliance checks, and rule overrides.</w:t>
+      </w:r>
+    </w:p>
+    <w:p>
+      <w:pPr>
+        <w:pStyle w:val="Heading3"/>
+        <w:keepNext/>
+        <w:spacing w:after="69" w:before="160" w:line="240" w:lineRule="auto"/>
+      </w:pPr>
+      <w:bookmarkStart w:name="bm_19" w:id="19"/>
+      <w:r>
+        <w:rPr>
+          <w:rFonts w:ascii="Google Sans Flex Medium" w:cs="Google Sans Flex Medium" w:eastAsia="Google Sans Flex Medium" w:hAnsi="Google Sans Flex Medium"/>
+          <w:b/>
+          <w:bCs/>
+          <w:i w:val="false"/>
+          <w:iCs w:val="false"/>
+          <w:color w:val="437FDB"/>
+          <w:sz w:val="28"/>
+          <w:szCs w:val="28"/>
+        </w:rPr>
+        <w:t xml:space="preserve">Target documents</w:t>
+      </w:r>
+      <w:bookmarkEnd w:id="19"/>
     </w:p>
     <w:p>
       <w:pPr>
@@ -2982,7 +3032,7 @@
           <w:ilvl w:val="0"/>
           <w:numId w:val="2"/>
         </w:numPr>
-        <w:spacing w:after="60" w:before="80" w:line="240" w:lineRule="auto"/>
+        <w:spacing w:after="40" w:before="80" w:line="240" w:lineRule="auto"/>
       </w:pPr>
       <w:r>
         <w:rPr>
@@ -2995,79 +3045,7 @@
           <w:sz w:val="20"/>
           <w:szCs w:val="20"/>
         </w:rPr>
-        <w:t xml:space="preserve">Never </w:t>
-      </w:r>
-      <w:r>
-        <w:rPr>
-          <w:rFonts w:ascii="Google Sans Flex Medium" w:cs="Google Sans Flex Medium" w:eastAsia="Google Sans Flex Medium" w:hAnsi="Google Sans Flex Medium"/>
-          <w:b w:val="false"/>
-          <w:bCs w:val="false"/>
-          <w:i w:val="false"/>
-          <w:iCs w:val="false"/>
-          <w:color w:val="3F7DDE"/>
-          <w:sz w:val="20"/>
-          <w:szCs w:val="20"/>
-        </w:rPr>
-        <w:t xml:space="preserve">ignore_validate</w:t>
-      </w:r>
-      <w:r>
-        <w:rPr>
-          <w:rFonts w:ascii="Google Sans Flex Normal" w:cs="Google Sans Flex Normal" w:eastAsia="Google Sans Flex Normal" w:hAnsi="Google Sans Flex Normal"/>
-          <w:b w:val="false"/>
-          <w:bCs w:val="false"/>
-          <w:i w:val="false"/>
-          <w:iCs w:val="false"/>
-          <w:color w:val="0f172a"/>
-          <w:sz w:val="20"/>
-          <w:szCs w:val="20"/>
-        </w:rPr>
-        <w:t xml:space="preserve">, never </w:t>
-      </w:r>
-      <w:r>
-        <w:rPr>
-          <w:rFonts w:ascii="Google Sans Flex Medium" w:cs="Google Sans Flex Medium" w:eastAsia="Google Sans Flex Medium" w:hAnsi="Google Sans Flex Medium"/>
-          <w:b w:val="false"/>
-          <w:bCs w:val="false"/>
-          <w:i w:val="false"/>
-          <w:iCs w:val="false"/>
-          <w:color w:val="3F7DDE"/>
-          <w:sz w:val="20"/>
-          <w:szCs w:val="20"/>
-        </w:rPr>
-        <w:t xml:space="preserve">ignore_mandatory</w:t>
-      </w:r>
-      <w:r>
-        <w:rPr>
-          <w:rFonts w:ascii="Google Sans Flex Normal" w:cs="Google Sans Flex Normal" w:eastAsia="Google Sans Flex Normal" w:hAnsi="Google Sans Flex Normal"/>
-          <w:b w:val="false"/>
-          <w:bCs w:val="false"/>
-          <w:i w:val="false"/>
-          <w:iCs w:val="false"/>
-          <w:color w:val="0f172a"/>
-          <w:sz w:val="20"/>
-          <w:szCs w:val="20"/>
-        </w:rPr>
-        <w:t xml:space="preserve"> - if ERPNext refuses, you see why</w:t>
-      </w:r>
-    </w:p>
-    <w:p>
-      <w:pPr>
-        <w:pStyle w:val="Heading3"/>
-        <w:keepNext/>
-        <w:spacing w:after="69" w:before="160" w:line="240" w:lineRule="auto"/>
-      </w:pPr>
-      <w:r>
-        <w:rPr>
-          <w:rFonts w:ascii="Google Sans Flex Medium" w:cs="Google Sans Flex Medium" w:eastAsia="Google Sans Flex Medium" w:hAnsi="Google Sans Flex Medium"/>
-          <w:b/>
-          <w:bCs/>
-          <w:i w:val="false"/>
-          <w:iCs w:val="false"/>
-          <w:color w:val="437FDB"/>
-          <w:sz w:val="28"/>
-          <w:szCs w:val="28"/>
-        </w:rPr>
-        <w:t xml:space="preserve">Reverse controls on ERPNext documents</w:t>
+        <w:t xml:space="preserve">Purchase Receipt, Subcontracting Receipt, Stock Entry, Delivery Note</w:t>
       </w:r>
     </w:p>
     <w:p>
@@ -3077,7 +3055,7 @@
           <w:ilvl w:val="0"/>
           <w:numId w:val="2"/>
         </w:numPr>
-        <w:spacing w:after="60" w:before="80" w:line="240" w:lineRule="auto"/>
+        <w:spacing w:after="40" w:before="80" w:line="240" w:lineRule="auto"/>
       </w:pPr>
       <w:r>
         <w:rPr>
@@ -3090,7 +3068,7 @@
           <w:sz w:val="20"/>
           <w:szCs w:val="20"/>
         </w:rPr>
-        <w:t xml:space="preserve">Require, or forbid, a gate pass on a receipt, transfer or dispatch</w:t>
+        <w:t xml:space="preserve">Auto on submit, manual button, or pulled from the target's own form</w:t>
       </w:r>
     </w:p>
     <w:p>
@@ -3100,7 +3078,7 @@
           <w:ilvl w:val="0"/>
           <w:numId w:val="2"/>
         </w:numPr>
-        <w:spacing w:after="60" w:before="80" w:line="240" w:lineRule="auto"/>
+        <w:spacing w:after="40" w:before="80" w:line="240" w:lineRule="auto"/>
       </w:pPr>
       <w:r>
         <w:rPr>
@@ -3113,7 +3091,7 @@
           <w:sz w:val="20"/>
           <w:szCs w:val="20"/>
         </w:rPr>
-        <w:t xml:space="preserve">Per-source-line quantity caps, not just document totals</w:t>
+        <w:t xml:space="preserve">Uses ERPNext's own mappers, so taxes, currency, terms and company defaults come along</w:t>
       </w:r>
     </w:p>
     <w:p>
@@ -3123,7 +3101,7 @@
           <w:ilvl w:val="0"/>
           <w:numId w:val="2"/>
         </w:numPr>
-        <w:spacing w:after="60" w:before="80" w:line="240" w:lineRule="auto"/>
+        <w:spacing w:after="40" w:before="80" w:line="240" w:lineRule="auto"/>
       </w:pPr>
       <w:r>
         <w:rPr>
@@ -3136,33 +3114,7 @@
           <w:sz w:val="20"/>
           <w:szCs w:val="20"/>
         </w:rPr>
-        <w:t xml:space="preserve">Row coverage check that </w:t>
-      </w:r>
-      <w:r>
-        <w:rPr>
-          <w:rFonts w:ascii="Google Sans Flex Medium" w:cs="Google Sans Flex Medium" w:eastAsia="Google Sans Flex Medium" w:hAnsi="Google Sans Flex Medium"/>
-          <w:b/>
-          <w:bCs/>
-          <w:i w:val="false"/>
-          <w:iCs w:val="false"/>
-          <w:color w:val="0f172a"/>
-          <w:sz w:val="20"/>
-          <w:szCs w:val="20"/>
-        </w:rPr>
-        <w:t xml:space="preserve">fails closed</w:t>
-      </w:r>
-      <w:r>
-        <w:rPr>
-          <w:rFonts w:ascii="Google Sans Flex Normal" w:cs="Google Sans Flex Normal" w:eastAsia="Google Sans Flex Normal" w:hAnsi="Google Sans Flex Normal"/>
-          <w:b w:val="false"/>
-          <w:bCs w:val="false"/>
-          <w:i w:val="false"/>
-          <w:iCs w:val="false"/>
-          <w:color w:val="0f172a"/>
-          <w:sz w:val="20"/>
-          <w:szCs w:val="20"/>
-        </w:rPr>
-        <w:t xml:space="preserve"> - unreferenced rows are reported, not skipped</w:t>
+        <w:t xml:space="preserve">Idempotent - a double click produces one receipt and a clear message</w:t>
       </w:r>
     </w:p>
     <w:p>
@@ -3172,7 +3124,7 @@
           <w:ilvl w:val="0"/>
           <w:numId w:val="2"/>
         </w:numPr>
-        <w:spacing w:after="60" w:before="80" w:line="240" w:lineRule="auto"/>
+        <w:spacing w:after="40" w:before="80" w:line="240" w:lineRule="auto"/>
       </w:pPr>
       <w:r>
         <w:rPr>
@@ -3185,7 +3137,7 @@
           <w:sz w:val="20"/>
           <w:szCs w:val="20"/>
         </w:rPr>
-        <w:t xml:space="preserve">Optionally remove the source form's native Create button, enforced server-side so API and bulk imports cannot bypass it</w:t>
+        <w:t xml:space="preserve">Savepoint per target: one failure rolls back only that target, and is reported</w:t>
       </w:r>
     </w:p>
     <w:p>
@@ -3195,7 +3147,7 @@
           <w:ilvl w:val="0"/>
           <w:numId w:val="2"/>
         </w:numPr>
-        <w:spacing w:after="60" w:before="80" w:line="240" w:lineRule="auto"/>
+        <w:spacing w:after="40" w:before="80" w:line="240" w:lineRule="auto"/>
       </w:pPr>
       <w:r>
         <w:rPr>
@@ -3208,8 +3160,57 @@
           <w:sz w:val="20"/>
           <w:szCs w:val="20"/>
         </w:rPr>
-        <w:t xml:space="preserve">Internal supplier and customer transfers skipped automatically</w:t>
-      </w:r>
+        <w:t xml:space="preserve">Never </w:t>
+      </w:r>
+      <w:r>
+        <w:rPr>
+          <w:rFonts w:ascii="Courier New" w:cs="Courier New" w:eastAsia="Courier New" w:hAnsi="Courier New"/>
+          <w:color w:val="0f172a"/>
+          <w:sz w:val="18"/>
+          <w:szCs w:val="18"/>
+        </w:rPr>
+        <w:t xml:space="preserve">ignore_validate</w:t>
+      </w:r>
+      <w:r>
+        <w:rPr>
+          <w:rFonts w:ascii="Google Sans Flex Normal" w:cs="Google Sans Flex Normal" w:eastAsia="Google Sans Flex Normal" w:hAnsi="Google Sans Flex Normal"/>
+          <w:b w:val="false"/>
+          <w:bCs w:val="false"/>
+          <w:i w:val="false"/>
+          <w:iCs w:val="false"/>
+          <w:color w:val="0f172a"/>
+          <w:sz w:val="20"/>
+          <w:szCs w:val="20"/>
+        </w:rPr>
+        <w:t xml:space="preserve">, never </w:t>
+      </w:r>
+      <w:r>
+        <w:rPr>
+          <w:rFonts w:ascii="Courier New" w:cs="Courier New" w:eastAsia="Courier New" w:hAnsi="Courier New"/>
+          <w:color w:val="0f172a"/>
+          <w:sz w:val="18"/>
+          <w:szCs w:val="18"/>
+        </w:rPr>
+        <w:t xml:space="preserve">ignore_mandatory</w:t>
+      </w:r>
+      <w:r>
+        <w:rPr>
+          <w:rFonts w:ascii="Google Sans Flex Normal" w:cs="Google Sans Flex Normal" w:eastAsia="Google Sans Flex Normal" w:hAnsi="Google Sans Flex Normal"/>
+          <w:b w:val="false"/>
+          <w:bCs w:val="false"/>
+          <w:i w:val="false"/>
+          <w:iCs w:val="false"/>
+          <w:color w:val="0f172a"/>
+          <w:sz w:val="20"/>
+          <w:szCs w:val="20"/>
+        </w:rPr>
+        <w:t xml:space="preserve"> - if ERPNext refuses, you see why</w:t>
+      </w:r>
+    </w:p>
+    <w:p>
+      <w:pPr>
+        <w:spacing w:after="60" w:before="0" w:line="240" w:lineRule="auto"/>
+      </w:pPr>
     </w:p>
     <w:p>
       <w:pPr>
@@ -3217,6 +3218,7 @@
         <w:keepNext/>
         <w:spacing w:after="69" w:before="160" w:line="240" w:lineRule="auto"/>
       </w:pPr>
+      <w:bookmarkStart w:name="bm_20" w:id="20"/>
       <w:r>
         <w:rPr>
           <w:rFonts w:ascii="Google Sans Flex Medium" w:cs="Google Sans Flex Medium" w:eastAsia="Google Sans Flex Medium" w:hAnsi="Google Sans Flex Medium"/>
@@ -3228,8 +3230,9 @@
           <w:sz w:val="28"/>
           <w:szCs w:val="28"/>
         </w:rPr>
-        <w:t xml:space="preserve">Compliance</w:t>
-      </w:r>
+        <w:t xml:space="preserve">Reverse controls on ERPNext documents</w:t>
+      </w:r>
+      <w:bookmarkEnd w:id="20"/>
     </w:p>
     <w:p>
       <w:pPr>
@@ -3238,7 +3241,7 @@
           <w:ilvl w:val="0"/>
           <w:numId w:val="2"/>
         </w:numPr>
-        <w:spacing w:after="60" w:before="80" w:line="240" w:lineRule="auto"/>
+        <w:spacing w:after="40" w:before="80" w:line="240" w:lineRule="auto"/>
       </w:pPr>
       <w:r>
         <w:rPr>
@@ -3251,7 +3254,7 @@
           <w:sz w:val="20"/>
           <w:szCs w:val="20"/>
         </w:rPr>
-        <w:t xml:space="preserve">Provider framework, registered through a hook</w:t>
+        <w:t xml:space="preserve">Require, or forbid, a gate pass on a receipt, transfer or dispatch</w:t>
       </w:r>
     </w:p>
     <w:p>
@@ -3261,7 +3264,7 @@
           <w:ilvl w:val="0"/>
           <w:numId w:val="2"/>
         </w:numPr>
-        <w:spacing w:after="60" w:before="80" w:line="240" w:lineRule="auto"/>
+        <w:spacing w:after="40" w:before="80" w:line="240" w:lineRule="auto"/>
       </w:pPr>
       <w:r>
         <w:rPr>
@@ -3274,7 +3277,7 @@
           <w:sz w:val="20"/>
           <w:szCs w:val="20"/>
         </w:rPr>
-        <w:t xml:space="preserve">India: E-Invoice (IRN) and E-Way Bill, thresholds from GST Settings</w:t>
+        <w:t xml:space="preserve">Per-source-line quantity caps, not just document totals</w:t>
       </w:r>
     </w:p>
     <w:p>
@@ -3284,7 +3287,7 @@
           <w:ilvl w:val="0"/>
           <w:numId w:val="2"/>
         </w:numPr>
-        <w:spacing w:after="60" w:before="80" w:line="240" w:lineRule="auto"/>
+        <w:spacing w:after="40" w:before="80" w:line="240" w:lineRule="auto"/>
       </w:pPr>
       <w:r>
         <w:rPr>
@@ -3297,7 +3300,33 @@
           <w:sz w:val="20"/>
           <w:szCs w:val="20"/>
         </w:rPr>
-        <w:t xml:space="preserve">Six statuses, colour-coded, with plain-language remediation</w:t>
+        <w:t xml:space="preserve">Row coverage check that </w:t>
+      </w:r>
+      <w:r>
+        <w:rPr>
+          <w:rFonts w:ascii="Google Sans Flex Medium" w:cs="Google Sans Flex Medium" w:eastAsia="Google Sans Flex Medium" w:hAnsi="Google Sans Flex Medium"/>
+          <w:b w:val="false"/>
+          <w:bCs w:val="false"/>
+          <w:i w:val="false"/>
+          <w:iCs w:val="false"/>
+          <w:color w:val="0f172a"/>
+          <w:sz w:val="20"/>
+          <w:szCs w:val="20"/>
+        </w:rPr>
+        <w:t xml:space="preserve">fails closed</w:t>
+      </w:r>
+      <w:r>
+        <w:rPr>
+          <w:rFonts w:ascii="Google Sans Flex Normal" w:cs="Google Sans Flex Normal" w:eastAsia="Google Sans Flex Normal" w:hAnsi="Google Sans Flex Normal"/>
+          <w:b w:val="false"/>
+          <w:bCs w:val="false"/>
+          <w:i w:val="false"/>
+          <w:iCs w:val="false"/>
+          <w:color w:val="0f172a"/>
+          <w:sz w:val="20"/>
+          <w:szCs w:val="20"/>
+        </w:rPr>
+        <w:t xml:space="preserve"> - unreferenced rows are reported, not skipped</w:t>
       </w:r>
     </w:p>
     <w:p>
@@ -3307,7 +3336,7 @@
           <w:ilvl w:val="0"/>
           <w:numId w:val="2"/>
         </w:numPr>
-        <w:spacing w:after="60" w:before="80" w:line="240" w:lineRule="auto"/>
+        <w:spacing w:after="40" w:before="80" w:line="240" w:lineRule="auto"/>
       </w:pPr>
       <w:r>
         <w:rPr>
@@ -3320,7 +3349,7 @@
           <w:sz w:val="20"/>
           <w:szCs w:val="20"/>
         </w:rPr>
-        <w:t xml:space="preserve">Re-check button, and automatic re-verification inside the submitting transaction</w:t>
+        <w:t xml:space="preserve">Optionally remove the source form's native Create button, enforced server-side so API and bulk imports cannot bypass it</w:t>
       </w:r>
     </w:p>
     <w:p>
@@ -3330,8 +3359,34 @@
           <w:ilvl w:val="0"/>
           <w:numId w:val="2"/>
         </w:numPr>
-        <w:spacing w:after="60" w:before="80" w:line="240" w:lineRule="auto"/>
-      </w:pPr>
+        <w:spacing w:after="40" w:before="80" w:line="240" w:lineRule="auto"/>
+      </w:pPr>
+      <w:r>
+        <w:rPr>
+          <w:rFonts w:ascii="Google Sans Flex Normal" w:cs="Google Sans Flex Normal" w:eastAsia="Google Sans Flex Normal" w:hAnsi="Google Sans Flex Normal"/>
+          <w:b w:val="false"/>
+          <w:bCs w:val="false"/>
+          <w:i w:val="false"/>
+          <w:iCs w:val="false"/>
+          <w:color w:val="0f172a"/>
+          <w:sz w:val="20"/>
+          <w:szCs w:val="20"/>
+        </w:rPr>
+        <w:t xml:space="preserve">Internal supplier and customer transfers skipped automatically</w:t>
+      </w:r>
+    </w:p>
+    <w:p>
+      <w:pPr>
+        <w:spacing w:after="60" w:before="0" w:line="240" w:lineRule="auto"/>
+      </w:pPr>
+    </w:p>
+    <w:p>
+      <w:pPr>
+        <w:pStyle w:val="Heading3"/>
+        <w:keepNext/>
+        <w:spacing w:after="69" w:before="160" w:line="240" w:lineRule="auto"/>
+      </w:pPr>
+      <w:bookmarkStart w:name="bm_21" w:id="21"/>
       <w:r>
         <w:rPr>
           <w:rFonts w:ascii="Google Sans Flex Medium" w:cs="Google Sans Flex Medium" w:eastAsia="Google Sans Flex Medium" w:hAnsi="Google Sans Flex Medium"/>
@@ -3339,25 +3394,13 @@
           <w:bCs/>
           <w:i w:val="false"/>
           <w:iCs w:val="false"/>
-          <w:color w:val="0f172a"/>
-          <w:sz w:val="20"/>
-          <w:szCs w:val="20"/>
-        </w:rPr>
-        <w:t xml:space="preserve">Fails closed</w:t>
-      </w:r>
-      <w:r>
-        <w:rPr>
-          <w:rFonts w:ascii="Google Sans Flex Normal" w:cs="Google Sans Flex Normal" w:eastAsia="Google Sans Flex Normal" w:hAnsi="Google Sans Flex Normal"/>
-          <w:b w:val="false"/>
-          <w:bCs w:val="false"/>
-          <w:i w:val="false"/>
-          <w:iCs w:val="false"/>
-          <w:color w:val="0f172a"/>
-          <w:sz w:val="20"/>
-          <w:szCs w:val="20"/>
-        </w:rPr>
-        <w:t xml:space="preserve"> when a provider is unreachable</w:t>
-      </w:r>
+          <w:color w:val="437FDB"/>
+          <w:sz w:val="28"/>
+          <w:szCs w:val="28"/>
+        </w:rPr>
+        <w:t xml:space="preserve">Compliance</w:t>
+      </w:r>
+      <w:bookmarkEnd w:id="21"/>
     </w:p>
     <w:p>
       <w:pPr>
@@ -3366,7 +3409,7 @@
           <w:ilvl w:val="0"/>
           <w:numId w:val="2"/>
         </w:numPr>
-        <w:spacing w:after="60" w:before="80" w:line="240" w:lineRule="auto"/>
+        <w:spacing w:after="40" w:before="80" w:line="240" w:lineRule="auto"/>
       </w:pPr>
       <w:r>
         <w:rPr>
@@ -3379,7 +3422,7 @@
           <w:sz w:val="20"/>
           <w:szCs w:val="20"/>
         </w:rPr>
-        <w:t xml:space="preserve">Overrides recorded with user and reason</w:t>
+        <w:t xml:space="preserve">Provider framework, registered through a hook</w:t>
       </w:r>
     </w:p>
     <w:p>
@@ -3389,7 +3432,7 @@
           <w:ilvl w:val="0"/>
           <w:numId w:val="2"/>
         </w:numPr>
-        <w:spacing w:after="60" w:before="80" w:line="240" w:lineRule="auto"/>
+        <w:spacing w:after="40" w:before="80" w:line="240" w:lineRule="auto"/>
       </w:pPr>
       <w:r>
         <w:rPr>
@@ -3402,27 +3445,7 @@
           <w:sz w:val="20"/>
           <w:szCs w:val="20"/>
         </w:rPr>
-        <w:t xml:space="preserve">Passing numbers printed on the gate slip the driver carries</w:t>
-      </w:r>
-    </w:p>
-    <w:p>
-      <w:pPr>
-        <w:pStyle w:val="Heading3"/>
-        <w:keepNext/>
-        <w:spacing w:after="69" w:before="160" w:line="240" w:lineRule="auto"/>
-      </w:pPr>
-      <w:r>
-        <w:rPr>
-          <w:rFonts w:ascii="Google Sans Flex Medium" w:cs="Google Sans Flex Medium" w:eastAsia="Google Sans Flex Medium" w:hAnsi="Google Sans Flex Medium"/>
-          <w:b/>
-          <w:bCs/>
-          <w:i w:val="false"/>
-          <w:iCs w:val="false"/>
-          <w:color w:val="437FDB"/>
-          <w:sz w:val="28"/>
-          <w:szCs w:val="28"/>
-        </w:rPr>
-        <w:t xml:space="preserve">Configuration</w:t>
+        <w:t xml:space="preserve">India: E-Invoice (IRN) and E-Way Bill, thresholds from GST Settings</w:t>
       </w:r>
     </w:p>
     <w:p>
@@ -3432,7 +3455,7 @@
           <w:ilvl w:val="0"/>
           <w:numId w:val="2"/>
         </w:numPr>
-        <w:spacing w:after="60" w:before="80" w:line="240" w:lineRule="auto"/>
+        <w:spacing w:after="40" w:before="80" w:line="240" w:lineRule="auto"/>
       </w:pPr>
       <w:r>
         <w:rPr>
@@ -3445,7 +3468,7 @@
           <w:sz w:val="20"/>
           <w:szCs w:val="20"/>
         </w:rPr>
-        <w:t xml:space="preserve">~70 global settings across ten tabs</w:t>
+        <w:t xml:space="preserve">Six statuses, colour-coded, with plain-language remediation</w:t>
       </w:r>
     </w:p>
     <w:p>
@@ -3455,7 +3478,7 @@
           <w:ilvl w:val="0"/>
           <w:numId w:val="2"/>
         </w:numPr>
-        <w:spacing w:after="60" w:before="80" w:line="240" w:lineRule="auto"/>
+        <w:spacing w:after="40" w:before="80" w:line="240" w:lineRule="auto"/>
       </w:pPr>
       <w:r>
         <w:rPr>
@@ -3468,7 +3491,7 @@
           <w:sz w:val="20"/>
           <w:szCs w:val="20"/>
         </w:rPr>
-        <w:t xml:space="preserve">60-rule table with per-rule action, threshold, bypass roles and custom message</w:t>
+        <w:t xml:space="preserve">Re-check button, and automatic re-verification inside the submitting transaction</w:t>
       </w:r>
     </w:p>
     <w:p>
@@ -3478,11 +3501,11 @@
           <w:ilvl w:val="0"/>
           <w:numId w:val="2"/>
         </w:numPr>
-        <w:spacing w:after="60" w:before="80" w:line="240" w:lineRule="auto"/>
-      </w:pPr>
-      <w:r>
-        <w:rPr>
-          <w:rFonts w:ascii="Google Sans Flex Normal" w:cs="Google Sans Flex Normal" w:eastAsia="Google Sans Flex Normal" w:hAnsi="Google Sans Flex Normal"/>
+        <w:spacing w:after="40" w:before="80" w:line="240" w:lineRule="auto"/>
+      </w:pPr>
+      <w:r>
+        <w:rPr>
+          <w:rFonts w:ascii="Google Sans Flex Medium" w:cs="Google Sans Flex Medium" w:eastAsia="Google Sans Flex Medium" w:hAnsi="Google Sans Flex Medium"/>
           <w:b w:val="false"/>
           <w:bCs w:val="false"/>
           <w:i w:val="false"/>
@@ -3491,7 +3514,20 @@
           <w:sz w:val="20"/>
           <w:szCs w:val="20"/>
         </w:rPr>
-        <w:t xml:space="preserve">Field rules: make any field mandatory, hidden or read-only, scoped by direction, type or flow</w:t>
+        <w:t xml:space="preserve">Fails closed</w:t>
+      </w:r>
+      <w:r>
+        <w:rPr>
+          <w:rFonts w:ascii="Google Sans Flex Normal" w:cs="Google Sans Flex Normal" w:eastAsia="Google Sans Flex Normal" w:hAnsi="Google Sans Flex Normal"/>
+          <w:b w:val="false"/>
+          <w:bCs w:val="false"/>
+          <w:i w:val="false"/>
+          <w:iCs w:val="false"/>
+          <w:color w:val="0f172a"/>
+          <w:sz w:val="20"/>
+          <w:szCs w:val="20"/>
+        </w:rPr>
+        <w:t xml:space="preserve"> when a provider is unreachable</w:t>
       </w:r>
     </w:p>
     <w:p>
@@ -3501,7 +3537,7 @@
           <w:ilvl w:val="0"/>
           <w:numId w:val="2"/>
         </w:numPr>
-        <w:spacing w:after="60" w:before="80" w:line="240" w:lineRule="auto"/>
+        <w:spacing w:after="40" w:before="80" w:line="240" w:lineRule="auto"/>
       </w:pPr>
       <w:r>
         <w:rPr>
@@ -3514,7 +3550,7 @@
           <w:sz w:val="20"/>
           <w:szCs w:val="20"/>
         </w:rPr>
-        <w:t xml:space="preserve">Document checklist and charge types</w:t>
+        <w:t xml:space="preserve">Overrides recorded with user and reason</w:t>
       </w:r>
     </w:p>
     <w:p>
@@ -3524,7 +3560,7 @@
           <w:ilvl w:val="0"/>
           <w:numId w:val="2"/>
         </w:numPr>
-        <w:spacing w:after="60" w:before="80" w:line="240" w:lineRule="auto"/>
+        <w:spacing w:after="40" w:before="80" w:line="240" w:lineRule="auto"/>
       </w:pPr>
       <w:r>
         <w:rPr>
@@ -3537,8 +3573,13 @@
           <w:sz w:val="20"/>
           <w:szCs w:val="20"/>
         </w:rPr>
-        <w:t xml:space="preserve">Four one-click enforcement presets</w:t>
-      </w:r>
+        <w:t xml:space="preserve">Passing numbers printed on the gate slip the driver carries</w:t>
+      </w:r>
+    </w:p>
+    <w:p>
+      <w:pPr>
+        <w:spacing w:after="60" w:before="0" w:line="240" w:lineRule="auto"/>
+      </w:pPr>
     </w:p>
     <w:p>
       <w:pPr>
@@ -3546,6 +3587,7 @@
         <w:keepNext/>
         <w:spacing w:after="69" w:before="160" w:line="240" w:lineRule="auto"/>
       </w:pPr>
+      <w:bookmarkStart w:name="bm_22" w:id="22"/>
       <w:r>
         <w:rPr>
           <w:rFonts w:ascii="Google Sans Flex Medium" w:cs="Google Sans Flex Medium" w:eastAsia="Google Sans Flex Medium" w:hAnsi="Google Sans Flex Medium"/>
@@ -3557,8 +3599,9 @@
           <w:sz w:val="28"/>
           <w:szCs w:val="28"/>
         </w:rPr>
-        <w:t xml:space="preserve">Access control</w:t>
-      </w:r>
+        <w:t xml:space="preserve">Configuration</w:t>
+      </w:r>
+      <w:bookmarkEnd w:id="22"/>
     </w:p>
     <w:p>
       <w:pPr>
@@ -3567,7 +3610,7 @@
           <w:ilvl w:val="0"/>
           <w:numId w:val="2"/>
         </w:numPr>
-        <w:spacing w:after="60" w:before="80" w:line="240" w:lineRule="auto"/>
+        <w:spacing w:after="40" w:before="80" w:line="240" w:lineRule="auto"/>
       </w:pPr>
       <w:r>
         <w:rPr>
@@ -3580,7 +3623,7 @@
           <w:sz w:val="20"/>
           <w:szCs w:val="20"/>
         </w:rPr>
-        <w:t xml:space="preserve">Four purpose-built roles</w:t>
+        <w:t xml:space="preserve">76 global settings in 18 sections</w:t>
       </w:r>
     </w:p>
     <w:p>
@@ -3590,7 +3633,7 @@
           <w:ilvl w:val="0"/>
           <w:numId w:val="2"/>
         </w:numPr>
-        <w:spacing w:after="60" w:before="80" w:line="240" w:lineRule="auto"/>
+        <w:spacing w:after="40" w:before="80" w:line="240" w:lineRule="auto"/>
       </w:pPr>
       <w:r>
         <w:rPr>
@@ -3603,7 +3646,7 @@
           <w:sz w:val="20"/>
           <w:szCs w:val="20"/>
         </w:rPr>
-        <w:t xml:space="preserve">Row-level restriction by source flow, location, gate and company</w:t>
+        <w:t xml:space="preserve">44 configurable rules with per-rule action, threshold, bypass roles and custom message, plus 16 fixed integrity checks</w:t>
       </w:r>
     </w:p>
     <w:p>
@@ -3613,7 +3656,7 @@
           <w:ilvl w:val="0"/>
           <w:numId w:val="2"/>
         </w:numPr>
-        <w:spacing w:after="60" w:before="80" w:line="240" w:lineRule="auto"/>
+        <w:spacing w:after="40" w:before="80" w:line="240" w:lineRule="auto"/>
       </w:pPr>
       <w:r>
         <w:rPr>
@@ -3626,78 +3669,7 @@
           <w:sz w:val="20"/>
           <w:szCs w:val="20"/>
         </w:rPr>
-        <w:t xml:space="preserve">Enforced in both the permission query and </w:t>
-      </w:r>
-      <w:r>
-        <w:rPr>
-          <w:rFonts w:ascii="Google Sans Flex Medium" w:cs="Google Sans Flex Medium" w:eastAsia="Google Sans Flex Medium" w:hAnsi="Google Sans Flex Medium"/>
-          <w:b w:val="false"/>
-          <w:bCs w:val="false"/>
-          <w:i w:val="false"/>
-          <w:iCs w:val="false"/>
-          <w:color w:val="3F7DDE"/>
-          <w:sz w:val="20"/>
-          <w:szCs w:val="20"/>
-        </w:rPr>
-        <w:t xml:space="preserve">has_permission</w:t>
-      </w:r>
-    </w:p>
-    <w:p>
-      <w:pPr>
-        <w:pStyle w:val="Heading3"/>
-        <w:keepNext/>
-        <w:spacing w:after="69" w:before="160" w:line="240" w:lineRule="auto"/>
-      </w:pPr>
-      <w:r>
-        <w:rPr>
-          <w:rFonts w:ascii="Google Sans Flex Medium" w:cs="Google Sans Flex Medium" w:eastAsia="Google Sans Flex Medium" w:hAnsi="Google Sans Flex Medium"/>
-          <w:b/>
-          <w:bCs/>
-          <w:i w:val="false"/>
-          <w:iCs w:val="false"/>
-          <w:color w:val="437FDB"/>
-          <w:sz w:val="28"/>
-          <w:szCs w:val="28"/>
-        </w:rPr>
-        <w:t xml:space="preserve">Reporting</w:t>
-      </w:r>
-    </w:p>
-    <w:p>
-      <w:pPr>
-        <w:spacing w:after="150" w:before="0" w:line="240" w:lineRule="auto"/>
-      </w:pPr>
-      <w:r>
-        <w:rPr>
-          <w:rFonts w:ascii="Google Sans Flex Normal" w:cs="Google Sans Flex Normal" w:eastAsia="Google Sans Flex Normal" w:hAnsi="Google Sans Flex Normal"/>
-          <w:b w:val="false"/>
-          <w:bCs w:val="false"/>
-          <w:i w:val="false"/>
-          <w:iCs w:val="false"/>
-          <w:color w:val="0f172a"/>
-          <w:sz w:val="22"/>
-          <w:szCs w:val="22"/>
-        </w:rPr>
-        <w:t xml:space="preserve">Pending Gate Passes (with ageing) · Gate Pass Register · Gate Pass vs Document Reconciliation · Discrepancy Register · Pending Returnable Gate Passes · Vehicle Movement &amp; Turnaround · Gate Pass Exceptions · Compliance Exceptions · Enforcement Impact Preview</w:t>
-      </w:r>
-    </w:p>
-    <w:p>
-      <w:pPr>
-        <w:pStyle w:val="Heading3"/>
-        <w:keepNext/>
-        <w:spacing w:after="69" w:before="160" w:line="240" w:lineRule="auto"/>
-      </w:pPr>
-      <w:r>
-        <w:rPr>
-          <w:rFonts w:ascii="Google Sans Flex Medium" w:cs="Google Sans Flex Medium" w:eastAsia="Google Sans Flex Medium" w:hAnsi="Google Sans Flex Medium"/>
-          <w:b/>
-          <w:bCs/>
-          <w:i w:val="false"/>
-          <w:iCs w:val="false"/>
-          <w:color w:val="437FDB"/>
-          <w:sz w:val="28"/>
-          <w:szCs w:val="28"/>
-        </w:rPr>
-        <w:t xml:space="preserve">Operations</w:t>
+        <w:t xml:space="preserve">Field rules: make any field mandatory, hidden or read-only, scoped by direction, type or flow</w:t>
       </w:r>
     </w:p>
     <w:p>
@@ -3707,7 +3679,7 @@
           <w:ilvl w:val="0"/>
           <w:numId w:val="2"/>
         </w:numPr>
-        <w:spacing w:after="60" w:before="80" w:line="240" w:lineRule="auto"/>
+        <w:spacing w:after="40" w:before="80" w:line="240" w:lineRule="auto"/>
       </w:pPr>
       <w:r>
         <w:rPr>
@@ -3720,7 +3692,7 @@
           <w:sz w:val="20"/>
           <w:szCs w:val="20"/>
         </w:rPr>
-        <w:t xml:space="preserve">Daily overdue-return detection with reminders and escalation</w:t>
+        <w:t xml:space="preserve">Document checklist and charge types</w:t>
       </w:r>
     </w:p>
     <w:p>
@@ -3730,7 +3702,7 @@
           <w:ilvl w:val="0"/>
           <w:numId w:val="2"/>
         </w:numPr>
-        <w:spacing w:after="60" w:before="80" w:line="240" w:lineRule="auto"/>
+        <w:spacing w:after="40" w:before="80" w:line="240" w:lineRule="auto"/>
       </w:pPr>
       <w:r>
         <w:rPr>
@@ -3743,8 +3715,35 @@
           <w:sz w:val="20"/>
           <w:szCs w:val="20"/>
         </w:rPr>
-        <w:t xml:space="preserve">Configurable audit-log retention</w:t>
-      </w:r>
+        <w:t xml:space="preserve">Four one-click enforcement presets</w:t>
+      </w:r>
+    </w:p>
+    <w:p>
+      <w:pPr>
+        <w:spacing w:after="60" w:before="0" w:line="240" w:lineRule="auto"/>
+      </w:pPr>
+    </w:p>
+    <w:p>
+      <w:pPr>
+        <w:pStyle w:val="Heading3"/>
+        <w:keepNext/>
+        <w:spacing w:after="69" w:before="160" w:line="240" w:lineRule="auto"/>
+      </w:pPr>
+      <w:bookmarkStart w:name="bm_23" w:id="23"/>
+      <w:r>
+        <w:rPr>
+          <w:rFonts w:ascii="Google Sans Flex Medium" w:cs="Google Sans Flex Medium" w:eastAsia="Google Sans Flex Medium" w:hAnsi="Google Sans Flex Medium"/>
+          <w:b/>
+          <w:bCs/>
+          <w:i w:val="false"/>
+          <w:iCs w:val="false"/>
+          <w:color w:val="437FDB"/>
+          <w:sz w:val="28"/>
+          <w:szCs w:val="28"/>
+        </w:rPr>
+        <w:t xml:space="preserve">Access control</w:t>
+      </w:r>
+      <w:bookmarkEnd w:id="23"/>
     </w:p>
     <w:p>
       <w:pPr>
@@ -3753,7 +3752,7 @@
           <w:ilvl w:val="0"/>
           <w:numId w:val="2"/>
         </w:numPr>
-        <w:spacing w:after="60" w:before="80" w:line="240" w:lineRule="auto"/>
+        <w:spacing w:after="40" w:before="80" w:line="240" w:lineRule="auto"/>
       </w:pPr>
       <w:r>
         <w:rPr>
@@ -3766,7 +3765,7 @@
           <w:sz w:val="20"/>
           <w:szCs w:val="20"/>
         </w:rPr>
-        <w:t xml:space="preserve">Structured JSON logging with three verbosity levels</w:t>
+        <w:t xml:space="preserve">Four purpose-built roles</w:t>
       </w:r>
     </w:p>
     <w:p>
@@ -3776,7 +3775,7 @@
           <w:ilvl w:val="0"/>
           <w:numId w:val="2"/>
         </w:numPr>
-        <w:spacing w:after="60" w:before="80" w:line="240" w:lineRule="auto"/>
+        <w:spacing w:after="40" w:before="80" w:line="240" w:lineRule="auto"/>
       </w:pPr>
       <w:r>
         <w:rPr>
@@ -3789,7 +3788,7 @@
           <w:sz w:val="20"/>
           <w:szCs w:val="20"/>
         </w:rPr>
-        <w:t xml:space="preserve">Idempotent install and migrate; rules and flows reconcile without overwriting your configuration</w:t>
+        <w:t xml:space="preserve">Row-level restriction by source flow, location, gate and company</w:t>
       </w:r>
     </w:p>
     <w:p>
@@ -3799,7 +3798,7 @@
           <w:ilvl w:val="0"/>
           <w:numId w:val="2"/>
         </w:numPr>
-        <w:spacing w:after="60" w:before="80" w:line="240" w:lineRule="auto"/>
+        <w:spacing w:after="40" w:before="80" w:line="240" w:lineRule="auto"/>
       </w:pPr>
       <w:r>
         <w:rPr>
@@ -3812,8 +3811,204 @@
           <w:sz w:val="20"/>
           <w:szCs w:val="20"/>
         </w:rPr>
+        <w:t xml:space="preserve">Enforced in both the permission query and </w:t>
+      </w:r>
+      <w:r>
+        <w:rPr>
+          <w:rFonts w:ascii="Courier New" w:cs="Courier New" w:eastAsia="Courier New" w:hAnsi="Courier New"/>
+          <w:color w:val="0f172a"/>
+          <w:sz w:val="18"/>
+          <w:szCs w:val="18"/>
+        </w:rPr>
+        <w:t xml:space="preserve">has_permission</w:t>
+      </w:r>
+    </w:p>
+    <w:p>
+      <w:pPr>
+        <w:spacing w:after="60" w:before="0" w:line="240" w:lineRule="auto"/>
+      </w:pPr>
+    </w:p>
+    <w:p>
+      <w:pPr>
+        <w:pStyle w:val="Heading3"/>
+        <w:keepNext/>
+        <w:spacing w:after="69" w:before="160" w:line="240" w:lineRule="auto"/>
+      </w:pPr>
+      <w:bookmarkStart w:name="bm_24" w:id="24"/>
+      <w:r>
+        <w:rPr>
+          <w:rFonts w:ascii="Google Sans Flex Medium" w:cs="Google Sans Flex Medium" w:eastAsia="Google Sans Flex Medium" w:hAnsi="Google Sans Flex Medium"/>
+          <w:b/>
+          <w:bCs/>
+          <w:i w:val="false"/>
+          <w:iCs w:val="false"/>
+          <w:color w:val="437FDB"/>
+          <w:sz w:val="28"/>
+          <w:szCs w:val="28"/>
+        </w:rPr>
+        <w:t xml:space="preserve">Reporting</w:t>
+      </w:r>
+      <w:bookmarkEnd w:id="24"/>
+    </w:p>
+    <w:p>
+      <w:pPr>
+        <w:spacing w:after="150" w:before="0" w:line="240" w:lineRule="auto"/>
+      </w:pPr>
+      <w:r>
+        <w:rPr>
+          <w:rFonts w:ascii="Google Sans Flex Normal" w:cs="Google Sans Flex Normal" w:eastAsia="Google Sans Flex Normal" w:hAnsi="Google Sans Flex Normal"/>
+          <w:b w:val="false"/>
+          <w:bCs w:val="false"/>
+          <w:i w:val="false"/>
+          <w:iCs w:val="false"/>
+          <w:color w:val="0f172a"/>
+          <w:sz w:val="22"/>
+          <w:szCs w:val="22"/>
+        </w:rPr>
+        <w:t xml:space="preserve">Pending Gate Passes (with ageing) · Gate Pass Register · Gate Pass vs Document Reconciliation · Discrepancy Register · Pending Returnable Gate Passes · Vehicle Movement &amp; Turnaround · Gate Pass Exceptions · Compliance Exceptions · Enforcement Impact Preview</w:t>
+      </w:r>
+    </w:p>
+    <w:p>
+      <w:pPr>
+        <w:pStyle w:val="Heading3"/>
+        <w:keepNext/>
+        <w:spacing w:after="69" w:before="160" w:line="240" w:lineRule="auto"/>
+      </w:pPr>
+      <w:bookmarkStart w:name="bm_25" w:id="25"/>
+      <w:r>
+        <w:rPr>
+          <w:rFonts w:ascii="Google Sans Flex Medium" w:cs="Google Sans Flex Medium" w:eastAsia="Google Sans Flex Medium" w:hAnsi="Google Sans Flex Medium"/>
+          <w:b/>
+          <w:bCs/>
+          <w:i w:val="false"/>
+          <w:iCs w:val="false"/>
+          <w:color w:val="437FDB"/>
+          <w:sz w:val="28"/>
+          <w:szCs w:val="28"/>
+        </w:rPr>
+        <w:t xml:space="preserve">Operations</w:t>
+      </w:r>
+      <w:bookmarkEnd w:id="25"/>
+    </w:p>
+    <w:p>
+      <w:pPr>
+        <w:pStyle w:val="ListParagraph"/>
+        <w:numPr>
+          <w:ilvl w:val="0"/>
+          <w:numId w:val="2"/>
+        </w:numPr>
+        <w:spacing w:after="40" w:before="80" w:line="240" w:lineRule="auto"/>
+      </w:pPr>
+      <w:r>
+        <w:rPr>
+          <w:rFonts w:ascii="Google Sans Flex Normal" w:cs="Google Sans Flex Normal" w:eastAsia="Google Sans Flex Normal" w:hAnsi="Google Sans Flex Normal"/>
+          <w:b w:val="false"/>
+          <w:bCs w:val="false"/>
+          <w:i w:val="false"/>
+          <w:iCs w:val="false"/>
+          <w:color w:val="0f172a"/>
+          <w:sz w:val="20"/>
+          <w:szCs w:val="20"/>
+        </w:rPr>
+        <w:t xml:space="preserve">Daily overdue-return detection with reminders and escalation</w:t>
+      </w:r>
+    </w:p>
+    <w:p>
+      <w:pPr>
+        <w:pStyle w:val="ListParagraph"/>
+        <w:numPr>
+          <w:ilvl w:val="0"/>
+          <w:numId w:val="2"/>
+        </w:numPr>
+        <w:spacing w:after="40" w:before="80" w:line="240" w:lineRule="auto"/>
+      </w:pPr>
+      <w:r>
+        <w:rPr>
+          <w:rFonts w:ascii="Google Sans Flex Normal" w:cs="Google Sans Flex Normal" w:eastAsia="Google Sans Flex Normal" w:hAnsi="Google Sans Flex Normal"/>
+          <w:b w:val="false"/>
+          <w:bCs w:val="false"/>
+          <w:i w:val="false"/>
+          <w:iCs w:val="false"/>
+          <w:color w:val="0f172a"/>
+          <w:sz w:val="20"/>
+          <w:szCs w:val="20"/>
+        </w:rPr>
+        <w:t xml:space="preserve">Configurable audit-log retention</w:t>
+      </w:r>
+    </w:p>
+    <w:p>
+      <w:pPr>
+        <w:pStyle w:val="ListParagraph"/>
+        <w:numPr>
+          <w:ilvl w:val="0"/>
+          <w:numId w:val="2"/>
+        </w:numPr>
+        <w:spacing w:after="40" w:before="80" w:line="240" w:lineRule="auto"/>
+      </w:pPr>
+      <w:r>
+        <w:rPr>
+          <w:rFonts w:ascii="Google Sans Flex Normal" w:cs="Google Sans Flex Normal" w:eastAsia="Google Sans Flex Normal" w:hAnsi="Google Sans Flex Normal"/>
+          <w:b w:val="false"/>
+          <w:bCs w:val="false"/>
+          <w:i w:val="false"/>
+          <w:iCs w:val="false"/>
+          <w:color w:val="0f172a"/>
+          <w:sz w:val="20"/>
+          <w:szCs w:val="20"/>
+        </w:rPr>
+        <w:t xml:space="preserve">Structured JSON logging with three verbosity levels</w:t>
+      </w:r>
+    </w:p>
+    <w:p>
+      <w:pPr>
+        <w:pStyle w:val="ListParagraph"/>
+        <w:numPr>
+          <w:ilvl w:val="0"/>
+          <w:numId w:val="2"/>
+        </w:numPr>
+        <w:spacing w:after="40" w:before="80" w:line="240" w:lineRule="auto"/>
+      </w:pPr>
+      <w:r>
+        <w:rPr>
+          <w:rFonts w:ascii="Google Sans Flex Normal" w:cs="Google Sans Flex Normal" w:eastAsia="Google Sans Flex Normal" w:hAnsi="Google Sans Flex Normal"/>
+          <w:b w:val="false"/>
+          <w:bCs w:val="false"/>
+          <w:i w:val="false"/>
+          <w:iCs w:val="false"/>
+          <w:color w:val="0f172a"/>
+          <w:sz w:val="20"/>
+          <w:szCs w:val="20"/>
+        </w:rPr>
+        <w:t xml:space="preserve">Idempotent install and migrate; rules and flows reconcile without overwriting your configuration</w:t>
+      </w:r>
+    </w:p>
+    <w:p>
+      <w:pPr>
+        <w:pStyle w:val="ListParagraph"/>
+        <w:numPr>
+          <w:ilvl w:val="0"/>
+          <w:numId w:val="2"/>
+        </w:numPr>
+        <w:spacing w:after="40" w:before="80" w:line="240" w:lineRule="auto"/>
+      </w:pPr>
+      <w:r>
+        <w:rPr>
+          <w:rFonts w:ascii="Google Sans Flex Normal" w:cs="Google Sans Flex Normal" w:eastAsia="Google Sans Flex Normal" w:hAnsi="Google Sans Flex Normal"/>
+          <w:b w:val="false"/>
+          <w:bCs w:val="false"/>
+          <w:i w:val="false"/>
+          <w:iCs w:val="false"/>
+          <w:color w:val="0f172a"/>
+          <w:sz w:val="20"/>
+          <w:szCs w:val="20"/>
+        </w:rPr>
         <w:t xml:space="preserve">Clean uninstall that removes app-owned fields and leaves your records alone</w:t>
       </w:r>
+    </w:p>
+    <w:p>
+      <w:pPr>
+        <w:spacing w:after="60" w:before="0" w:line="240" w:lineRule="auto"/>
+      </w:pPr>
     </w:p>
     <w:p>
       <w:pPr>
@@ -3821,6 +4016,7 @@
         <w:keepNext/>
         <w:spacing w:after="92" w:before="200" w:line="240" w:lineRule="auto"/>
       </w:pPr>
+      <w:bookmarkStart w:name="bm_26" w:id="26"/>
       <w:r>
         <w:rPr>
           <w:rFonts w:ascii="Google Sans Flex Medium" w:cs="Google Sans Flex Medium" w:eastAsia="Google Sans Flex Medium" w:hAnsi="Google Sans Flex Medium"/>
@@ -3834,6 +4030,7 @@
         </w:rPr>
         <w:t xml:space="preserve">Objection handling</w:t>
       </w:r>
+      <w:bookmarkEnd w:id="26"/>
     </w:p>
     <w:p>
       <w:pPr>
@@ -3842,8 +4039,8 @@
       <w:r>
         <w:rPr>
           <w:rFonts w:ascii="Google Sans Flex Medium" w:cs="Google Sans Flex Medium" w:eastAsia="Google Sans Flex Medium" w:hAnsi="Google Sans Flex Medium"/>
-          <w:b/>
-          <w:bCs/>
+          <w:b w:val="false"/>
+          <w:bCs w:val="false"/>
           <w:i w:val="false"/>
           <w:iCs w:val="false"/>
           <w:color w:val="0f172a"/>
@@ -3873,8 +4070,8 @@
       <w:r>
         <w:rPr>
           <w:rFonts w:ascii="Google Sans Flex Medium" w:cs="Google Sans Flex Medium" w:eastAsia="Google Sans Flex Medium" w:hAnsi="Google Sans Flex Medium"/>
-          <w:b/>
-          <w:bCs/>
+          <w:b w:val="false"/>
+          <w:bCs w:val="false"/>
           <w:i w:val="false"/>
           <w:iCs w:val="false"/>
           <w:color w:val="0f172a"/>
@@ -3904,8 +4101,8 @@
       <w:r>
         <w:rPr>
           <w:rFonts w:ascii="Google Sans Flex Medium" w:cs="Google Sans Flex Medium" w:eastAsia="Google Sans Flex Medium" w:hAnsi="Google Sans Flex Medium"/>
-          <w:b/>
-          <w:bCs/>
+          <w:b w:val="false"/>
+          <w:bCs w:val="false"/>
           <w:i w:val="false"/>
           <w:iCs w:val="false"/>
           <w:color w:val="0f172a"/>
@@ -3935,8 +4132,8 @@
       <w:r>
         <w:rPr>
           <w:rFonts w:ascii="Google Sans Flex Medium" w:cs="Google Sans Flex Medium" w:eastAsia="Google Sans Flex Medium" w:hAnsi="Google Sans Flex Medium"/>
-          <w:b/>
-          <w:bCs/>
+          <w:b w:val="false"/>
+          <w:bCs w:val="false"/>
           <w:i w:val="false"/>
           <w:iCs w:val="false"/>
           <w:color w:val="0f172a"/>
@@ -3960,14 +4157,10 @@
       </w:r>
       <w:r>
         <w:rPr>
-          <w:rFonts w:ascii="Google Sans Flex Medium" w:cs="Google Sans Flex Medium" w:eastAsia="Google Sans Flex Medium" w:hAnsi="Google Sans Flex Medium"/>
-          <w:b w:val="false"/>
-          <w:bCs w:val="false"/>
-          <w:i w:val="false"/>
-          <w:iCs w:val="false"/>
-          <w:color w:val="3F7DDE"/>
-          <w:sz w:val="22"/>
-          <w:szCs w:val="22"/>
+          <w:rFonts w:ascii="Courier New" w:cs="Courier New" w:eastAsia="Courier New" w:hAnsi="Courier New"/>
+          <w:color w:val="0f172a"/>
+          <w:sz w:val="20"/>
+          <w:szCs w:val="20"/>
         </w:rPr>
         <w:t xml:space="preserve">india_compliance</w:t>
       </w:r>
@@ -3982,7 +4175,7 @@
           <w:sz w:val="22"/>
           <w:szCs w:val="22"/>
         </w:rPr>
-        <w:t xml:space="preserve"> and GST Settings. Thresholds come from the state-wise master, never hard-coded. Overrides are possible but always recorded.</w:t>
+        <w:t xml:space="preserve"> and GST Settings when that app is installed. Thresholds come from the state-wise master, never hard-coded. Overrides are possible but always recorded.</w:t>
       </w:r>
     </w:p>
     <w:p>
@@ -3992,8 +4185,8 @@
       <w:r>
         <w:rPr>
           <w:rFonts w:ascii="Google Sans Flex Medium" w:cs="Google Sans Flex Medium" w:eastAsia="Google Sans Flex Medium" w:hAnsi="Google Sans Flex Medium"/>
-          <w:b/>
-          <w:bCs/>
+          <w:b w:val="false"/>
+          <w:bCs w:val="false"/>
           <w:i w:val="false"/>
           <w:iCs w:val="false"/>
           <w:color w:val="0f172a"/>
@@ -4023,8 +4216,8 @@
       <w:r>
         <w:rPr>
           <w:rFonts w:ascii="Google Sans Flex Medium" w:cs="Google Sans Flex Medium" w:eastAsia="Google Sans Flex Medium" w:hAnsi="Google Sans Flex Medium"/>
-          <w:b/>
-          <w:bCs/>
+          <w:b w:val="false"/>
+          <w:bCs w:val="false"/>
           <w:i w:val="false"/>
           <w:iCs w:val="false"/>
           <w:color w:val="0f172a"/>
@@ -4053,6 +4246,7 @@
         <w:keepNext/>
         <w:spacing w:after="92" w:before="200" w:line="240" w:lineRule="auto"/>
       </w:pPr>
+      <w:bookmarkStart w:name="bm_27" w:id="27"/>
       <w:r>
         <w:rPr>
           <w:rFonts w:ascii="Google Sans Flex Medium" w:cs="Google Sans Flex Medium" w:eastAsia="Google Sans Flex Medium" w:hAnsi="Google Sans Flex Medium"/>
@@ -4066,6 +4260,7 @@
         </w:rPr>
         <w:t xml:space="preserve">Requirements</w:t>
       </w:r>
+      <w:bookmarkEnd w:id="27"/>
     </w:p>
     <w:p>
       <w:pPr>
@@ -4086,14 +4281,10 @@
       </w:r>
       <w:r>
         <w:rPr>
-          <w:rFonts w:ascii="Google Sans Flex Medium" w:cs="Google Sans Flex Medium" w:eastAsia="Google Sans Flex Medium" w:hAnsi="Google Sans Flex Medium"/>
-          <w:b w:val="false"/>
-          <w:bCs w:val="false"/>
-          <w:i w:val="false"/>
-          <w:iCs w:val="false"/>
-          <w:color w:val="3F7DDE"/>
-          <w:sz w:val="22"/>
-          <w:szCs w:val="22"/>
+          <w:rFonts w:ascii="Courier New" w:cs="Courier New" w:eastAsia="Courier New" w:hAnsi="Courier New"/>
+          <w:color w:val="0f172a"/>
+          <w:sz w:val="20"/>
+          <w:szCs w:val="20"/>
         </w:rPr>
         <w:t xml:space="preserve">india_compliance</w:t>
       </w:r>
@@ -4112,22 +4303,18 @@
       </w:r>
     </w:p>
     <w:sectPr>
-      <w:headerReference w:type="default" r:id="rId7"/>
-      <w:headerReference w:type="first" r:id="rId8"/>
-      <w:footerReference w:type="default" r:id="rId9"/>
-      <w:footerReference w:type="first" r:id="rId10"/>
+      <w:headerReference w:type="default" r:id="rId6"/>
+      <w:headerReference w:type="first" r:id="rId7"/>
+      <w:footerReference w:type="default" r:id="rId8"/>
+      <w:footerReference w:type="first" r:id="rId9"/>
       <w:pgSz w:w="11906" w:h="16838" w:orient="portrait"/>
       <w:pgMar w:top="288" w:right="1152" w:bottom="288" w:left="1152" w:header="144" w:footer="144" w:gutter="0"/>
-      <w:pgNumType/>
+      <w:pgNumType w:start="0"/>
       <w:titlePg/>
       <w:docGrid w:linePitch="360"/>
     </w:sectPr>
   </w:body>
 </w:document>
-</file>
-
-<file path=word/comments.xml><?xml version="1.0" encoding="utf-8"?>
-<w:comments xmlns:cx="http://schemas.microsoft.com/office/drawing/2014/chartex" xmlns:cx1="http://schemas.microsoft.com/office/drawing/2015/9/8/chartex" xmlns:cx2="http://schemas.microsoft.com/office/drawing/2015/10/21/chartex" xmlns:cx3="http://schemas.microsoft.com/office/drawing/2016/5/9/chartex" xmlns:cx4="http://schemas.microsoft.com/office/drawing/2016/5/10/chartex" xmlns:cx5="http://schemas.microsoft.com/office/drawing/2016/5/11/chartex" xmlns:cx6="http://schemas.microsoft.com/office/drawing/2016/5/12/chartex" xmlns:cx7="http://schemas.microsoft.com/office/drawing/2016/5/13/chartex" xmlns:cx8="http://schemas.microsoft.com/office/drawing/2016/5/14/chartex" xmlns:mc="http://schemas.openxmlformats.org/markup-compatibility/2006" xmlns:aink="http://schemas.microsoft.com/office/drawing/2016/ink" xmlns:am3d="http://schemas.microsoft.com/office/drawing/2017/model3d" xmlns:o="urn:schemas-microsoft-com:office:office" xmlns:r="http://schemas.openxmlformats.org/officeDocument/2006/relationships" xmlns:m="http://schemas.openxmlformats.org/officeDocument/2006/math" xmlns:v="urn:schemas-microsoft-com:vml" xmlns:wp14="http://schemas.microsoft.com/office/word/2010/wordprocessingDrawing" xmlns:wp="http://schemas.openxmlformats.org/drawingml/2006/wordprocessingDrawing" xmlns:w10="urn:schemas-microsoft-com:office:word" xmlns:w="http://schemas.openxmlformats.org/wordprocessingml/2006/main" xmlns:w14="http://schemas.microsoft.com/office/word/2010/wordml" xmlns:w15="http://schemas.microsoft.com/office/word/2012/wordml" xmlns:w16cex="http://schemas.microsoft.com/office/word/2018/wordml/cex" xmlns:w16cid="http://schemas.microsoft.com/office/word/2016/wordml/cid" xmlns:w16="http://schemas.microsoft.com/office/word/2018/wordml" xmlns:w16sdtdh="http://schemas.microsoft.com/office/word/2020/wordml/sdtdatahash" xmlns:w16se="http://schemas.microsoft.com/office/word/2015/wordml/symex" xmlns:wpg="http://schemas.microsoft.com/office/word/2010/wordprocessingGroup" xmlns:wpi="http://schemas.microsoft.com/office/word/2010/wordprocessingInk" xmlns:wne="http://schemas.microsoft.com/office/word/2006/wordml" xmlns:wps="http://schemas.microsoft.com/office/word/2010/wordprocessingShape"/>
 </file>
 
 <file path=word/endnotes.xml><?xml version="1.0" encoding="utf-8"?>
@@ -4178,12 +4365,12 @@
     <w:tblPr>
       <w:tblW w:type="dxa" w:w="9602"/>
       <w:tblBorders>
-        <w:top w:val="nil"/>
-        <w:left w:val="nil"/>
-        <w:bottom w:val="nil"/>
-        <w:right w:val="nil"/>
-        <w:insideH w:val="nil"/>
-        <w:insideV w:val="nil"/>
+        <w:top w:val="none" w:color="FFFFFF" w:sz="0"/>
+        <w:left w:val="none" w:color="FFFFFF" w:sz="0"/>
+        <w:bottom w:val="none" w:color="FFFFFF" w:sz="0"/>
+        <w:right w:val="none" w:color="FFFFFF" w:sz="0"/>
+        <w:insideH w:val="none" w:color="FFFFFF" w:sz="0"/>
+        <w:insideV w:val="none" w:color="FFFFFF" w:sz="0"/>
       </w:tblBorders>
       <w:tblLayout w:type="fixed"/>
     </w:tblPr>
@@ -4197,9 +4384,9 @@
           <w:tcW w:type="dxa" w:w="4801"/>
           <w:tcBorders>
             <w:top w:val="single" w:color="cbd5e1" w:sz="4"/>
-            <w:left w:val="nil"/>
-            <w:bottom w:val="nil"/>
-            <w:right w:val="nil"/>
+            <w:left w:val="none" w:color="FFFFFF" w:sz="0"/>
+            <w:bottom w:val="none" w:color="FFFFFF" w:sz="0"/>
+            <w:right w:val="none" w:color="FFFFFF" w:sz="0"/>
           </w:tcBorders>
           <w:tcMar>
             <w:top w:type="dxa" w:w="80"/>
@@ -4216,10 +4403,6 @@
           <w:r>
             <w:rPr>
               <w:rFonts w:ascii="Google Sans Flex Normal" w:cs="Google Sans Flex Normal" w:eastAsia="Google Sans Flex Normal" w:hAnsi="Google Sans Flex Normal"/>
-              <w:b w:val="false"/>
-              <w:bCs w:val="false"/>
-              <w:i w:val="false"/>
-              <w:iCs w:val="false"/>
               <w:color w:val="64748b"/>
               <w:sz w:val="18"/>
               <w:szCs w:val="18"/>
@@ -4233,9 +4416,9 @@
           <w:tcW w:type="dxa" w:w="4801"/>
           <w:tcBorders>
             <w:top w:val="single" w:color="cbd5e1" w:sz="4"/>
-            <w:left w:val="nil"/>
-            <w:bottom w:val="nil"/>
-            <w:right w:val="nil"/>
+            <w:left w:val="none" w:color="FFFFFF" w:sz="0"/>
+            <w:bottom w:val="none" w:color="FFFFFF" w:sz="0"/>
+            <w:right w:val="none" w:color="FFFFFF" w:sz="0"/>
           </w:tcBorders>
           <w:tcMar>
             <w:top w:type="dxa" w:w="80"/>
@@ -4257,9 +4440,41 @@
               <w:szCs w:val="18"/>
             </w:rPr>
             <w:t xml:space="preserve">Page </w:t>
+          </w:r>
+          <w:r>
+            <w:rPr>
+              <w:rFonts w:ascii="Google Sans Flex Normal" w:cs="Google Sans Flex Normal" w:eastAsia="Google Sans Flex Normal" w:hAnsi="Google Sans Flex Normal"/>
+              <w:color w:val="64748b"/>
+              <w:sz w:val="18"/>
+              <w:szCs w:val="18"/>
+            </w:rPr>
             <w:fldChar w:fldCharType="begin"/>
+          </w:r>
+          <w:r>
+            <w:rPr>
+              <w:rFonts w:ascii="Google Sans Flex Normal" w:cs="Google Sans Flex Normal" w:eastAsia="Google Sans Flex Normal" w:hAnsi="Google Sans Flex Normal"/>
+              <w:color w:val="64748b"/>
+              <w:sz w:val="18"/>
+              <w:szCs w:val="18"/>
+            </w:rPr>
             <w:instrText xml:space="preserve">PAGE</w:instrText>
+          </w:r>
+          <w:r>
+            <w:rPr>
+              <w:rFonts w:ascii="Google Sans Flex Normal" w:cs="Google Sans Flex Normal" w:eastAsia="Google Sans Flex Normal" w:hAnsi="Google Sans Flex Normal"/>
+              <w:color w:val="64748b"/>
+              <w:sz w:val="18"/>
+              <w:szCs w:val="18"/>
+            </w:rPr>
             <w:fldChar w:fldCharType="separate"/>
+          </w:r>
+          <w:r>
+            <w:rPr>
+              <w:rFonts w:ascii="Google Sans Flex Normal" w:cs="Google Sans Flex Normal" w:eastAsia="Google Sans Flex Normal" w:hAnsi="Google Sans Flex Normal"/>
+              <w:color w:val="64748b"/>
+              <w:sz w:val="18"/>
+              <w:szCs w:val="18"/>
+            </w:rPr>
             <w:fldChar w:fldCharType="end"/>
           </w:r>
         </w:p>
@@ -4285,12 +4500,12 @@
     <w:tblPr>
       <w:tblW w:type="dxa" w:w="9602"/>
       <w:tblBorders>
-        <w:top w:val="nil"/>
-        <w:left w:val="nil"/>
-        <w:bottom w:val="nil"/>
-        <w:right w:val="nil"/>
-        <w:insideH w:val="nil"/>
-        <w:insideV w:val="nil"/>
+        <w:top w:val="none" w:color="FFFFFF" w:sz="0"/>
+        <w:left w:val="none" w:color="FFFFFF" w:sz="0"/>
+        <w:bottom w:val="none" w:color="FFFFFF" w:sz="0"/>
+        <w:right w:val="none" w:color="FFFFFF" w:sz="0"/>
+        <w:insideH w:val="none" w:color="FFFFFF" w:sz="0"/>
+        <w:insideV w:val="none" w:color="FFFFFF" w:sz="0"/>
       </w:tblBorders>
       <w:tblLayout w:type="fixed"/>
     </w:tblPr>
@@ -4304,9 +4519,9 @@
           <w:tcW w:type="dxa" w:w="6517"/>
           <w:tcBorders>
             <w:top w:val="single" w:color="cbd5e1" w:sz="4"/>
-            <w:left w:val="nil"/>
-            <w:bottom w:val="nil"/>
-            <w:right w:val="nil"/>
+            <w:left w:val="none" w:color="FFFFFF" w:sz="0"/>
+            <w:bottom w:val="none" w:color="FFFFFF" w:sz="0"/>
+            <w:right w:val="none" w:color="FFFFFF" w:sz="0"/>
           </w:tcBorders>
           <w:tcMar>
             <w:top w:type="dxa" w:w="80"/>
@@ -4319,15 +4534,12 @@
         <w:p>
           <w:pPr>
             <w:spacing w:after="40" w:before="0" w:line="240" w:lineRule="auto"/>
-            <w:jc w:val="left"/>
           </w:pPr>
           <w:r>
             <w:rPr>
               <w:rFonts w:ascii="Google Sans Flex Medium" w:cs="Google Sans Flex Medium" w:eastAsia="Google Sans Flex Medium" w:hAnsi="Google Sans Flex Medium"/>
               <w:b w:val="false"/>
               <w:bCs w:val="false"/>
-              <w:i w:val="false"/>
-              <w:iCs w:val="false"/>
               <w:color w:val="0f172a"/>
               <w:sz w:val="22"/>
               <w:szCs w:val="22"/>
@@ -4338,15 +4550,10 @@
         <w:p>
           <w:pPr>
             <w:spacing w:after="40" w:before="0" w:line="240" w:lineRule="auto"/>
-            <w:jc w:val="left"/>
           </w:pPr>
           <w:r>
             <w:rPr>
               <w:rFonts w:ascii="Google Sans Flex Normal" w:cs="Google Sans Flex Normal" w:eastAsia="Google Sans Flex Normal" w:hAnsi="Google Sans Flex Normal"/>
-              <w:b w:val="false"/>
-              <w:bCs w:val="false"/>
-              <w:i w:val="false"/>
-              <w:iCs w:val="false"/>
               <w:color w:val="64748b"/>
               <w:sz w:val="18"/>
               <w:szCs w:val="18"/>
@@ -4357,15 +4564,10 @@
         <w:p>
           <w:pPr>
             <w:spacing w:after="0" w:before="0" w:line="240" w:lineRule="auto"/>
-            <w:jc w:val="left"/>
           </w:pPr>
           <w:r>
             <w:rPr>
               <w:rFonts w:ascii="Google Sans Flex Normal" w:cs="Google Sans Flex Normal" w:eastAsia="Google Sans Flex Normal" w:hAnsi="Google Sans Flex Normal"/>
-              <w:b w:val="false"/>
-              <w:bCs w:val="false"/>
-              <w:i w:val="false"/>
-              <w:iCs w:val="false"/>
               <w:color w:val="64748b"/>
               <w:sz w:val="18"/>
               <w:szCs w:val="18"/>
@@ -4379,9 +4581,9 @@
           <w:tcW w:type="dxa" w:w="3085"/>
           <w:tcBorders>
             <w:top w:val="single" w:color="cbd5e1" w:sz="4"/>
-            <w:left w:val="nil"/>
-            <w:bottom w:val="nil"/>
-            <w:right w:val="nil"/>
+            <w:left w:val="none" w:color="FFFFFF" w:sz="0"/>
+            <w:bottom w:val="none" w:color="FFFFFF" w:sz="0"/>
+            <w:right w:val="none" w:color="FFFFFF" w:sz="0"/>
           </w:tcBorders>
           <w:tcMar>
             <w:top w:type="dxa" w:w="72"/>
@@ -4399,10 +4601,6 @@
           <w:r>
             <w:rPr>
               <w:rFonts w:ascii="Google Sans Flex Normal" w:cs="Google Sans Flex Normal" w:eastAsia="Google Sans Flex Normal" w:hAnsi="Google Sans Flex Normal"/>
-              <w:b w:val="false"/>
-              <w:bCs w:val="false"/>
-              <w:i w:val="false"/>
-              <w:iCs w:val="false"/>
               <w:color w:val="64748b"/>
               <w:sz w:val="18"/>
               <w:szCs w:val="18"/>
@@ -4418,10 +4616,6 @@
           <w:r>
             <w:rPr>
               <w:rFonts w:ascii="Google Sans Flex Normal" w:cs="Google Sans Flex Normal" w:eastAsia="Google Sans Flex Normal" w:hAnsi="Google Sans Flex Normal"/>
-              <w:b w:val="false"/>
-              <w:bCs w:val="false"/>
-              <w:i w:val="false"/>
-              <w:iCs w:val="false"/>
               <w:color w:val="64748b"/>
               <w:sz w:val="18"/>
               <w:szCs w:val="18"/>
@@ -4434,14 +4628,10 @@
             <w:spacing w:after="0" w:before="0" w:line="240" w:lineRule="auto"/>
             <w:jc w:val="right"/>
           </w:pPr>
-          <w:hyperlink w:history="1" r:id="rIdofenafagoiieq0-ekfngi">
+          <w:hyperlink w:history="1" r:id="rIdultva3jozprzsvfw2bxhi">
             <w:r>
               <w:rPr>
                 <w:rFonts w:ascii="Google Sans Flex Normal" w:cs="Google Sans Flex Normal" w:eastAsia="Google Sans Flex Normal" w:hAnsi="Google Sans Flex Normal"/>
-                <w:b w:val="false"/>
-                <w:bCs w:val="false"/>
-                <w:i w:val="false"/>
-                <w:iCs w:val="false"/>
                 <w:color w:val="3F7DDE"/>
                 <w:sz w:val="18"/>
                 <w:szCs w:val="18"/>
@@ -4510,12 +4700,12 @@
     <w:tblPr>
       <w:tblW w:type="dxa" w:w="9602"/>
       <w:tblBorders>
-        <w:top w:val="nil"/>
-        <w:left w:val="nil"/>
-        <w:bottom w:val="nil"/>
-        <w:right w:val="nil"/>
-        <w:insideH w:val="nil"/>
-        <w:insideV w:val="nil"/>
+        <w:top w:val="none" w:color="FFFFFF" w:sz="0"/>
+        <w:left w:val="none" w:color="FFFFFF" w:sz="0"/>
+        <w:bottom w:val="none" w:color="FFFFFF" w:sz="0"/>
+        <w:right w:val="none" w:color="FFFFFF" w:sz="0"/>
+        <w:insideH w:val="none" w:color="FFFFFF" w:sz="0"/>
+        <w:insideV w:val="none" w:color="FFFFFF" w:sz="0"/>
       </w:tblBorders>
       <w:tblLayout w:type="fixed"/>
     </w:tblPr>
@@ -4528,10 +4718,10 @@
         <w:tcPr>
           <w:tcW w:type="dxa" w:w="4602"/>
           <w:tcBorders>
-            <w:top w:val="nil"/>
-            <w:left w:val="nil"/>
+            <w:top w:val="none" w:color="FFFFFF" w:sz="0"/>
+            <w:left w:val="none" w:color="FFFFFF" w:sz="0"/>
             <w:bottom w:val="single" w:color="ebf3ff" w:sz="4"/>
-            <w:right w:val="nil"/>
+            <w:right w:val="none" w:color="FFFFFF" w:sz="0"/>
           </w:tcBorders>
           <w:tcMar>
             <w:top w:type="dxa" w:w="0"/>
@@ -4547,9 +4737,9 @@
           <w:r>
             <w:drawing>
               <wp:inline distT="0" distB="0" distL="0" distR="0">
-                <wp:extent cx="685800" cy="314325"/>
+                <wp:extent cx="914400" cy="428625"/>
                 <wp:effectExtent t="0" r="0" b="0" l="0"/>
-                <wp:docPr id="1" name="" descr="" title=""/>
+                <wp:docPr id="1" name=""/>
                 <wp:cNvGraphicFramePr>
                   <a:graphicFrameLocks xmlns:a="http://schemas.openxmlformats.org/drawingml/2006/main" noChangeAspect="1"/>
                 </wp:cNvGraphicFramePr>
@@ -4572,7 +4762,7 @@
                       <pic:spPr bwMode="auto">
                         <a:xfrm>
                           <a:off x="0" y="0"/>
-                          <a:ext cx="685800" cy="314325"/>
+                          <a:ext cx="914400" cy="428625"/>
                         </a:xfrm>
                         <a:prstGeom prst="rect">
                           <a:avLst/>
@@ -4590,10 +4780,10 @@
         <w:tcPr>
           <w:tcW w:type="dxa" w:w="5000"/>
           <w:tcBorders>
-            <w:top w:val="nil"/>
-            <w:left w:val="nil"/>
+            <w:top w:val="none" w:color="FFFFFF" w:sz="0"/>
+            <w:left w:val="none" w:color="FFFFFF" w:sz="0"/>
             <w:bottom w:val="single" w:color="ebf3ff" w:sz="4"/>
-            <w:right w:val="nil"/>
+            <w:right w:val="none" w:color="FFFFFF" w:sz="0"/>
           </w:tcBorders>
           <w:tcMar>
             <w:top w:type="dxa" w:w="0"/>
@@ -4615,10 +4805,6 @@
           <w:r>
             <w:rPr>
               <w:rFonts w:ascii="Google Sans Flex Normal" w:cs="Google Sans Flex Normal" w:eastAsia="Google Sans Flex Normal" w:hAnsi="Google Sans Flex Normal"/>
-              <w:b w:val="false"/>
-              <w:bCs w:val="false"/>
-              <w:i w:val="false"/>
-              <w:iCs w:val="false"/>
               <w:color w:val="64748b"/>
               <w:sz w:val="18"/>
               <w:szCs w:val="18"/>
@@ -4638,14 +4824,20 @@
 </file>
 
 <file path=word/header2.xml><?xml version="1.0" encoding="utf-8"?>
-<w:hdr xmlns:wpc="http://schemas.microsoft.com/office/word/2010/wordprocessingCanvas" xmlns:mc="http://schemas.openxmlformats.org/markup-compatibility/2006" xmlns:o="urn:schemas-microsoft-com:office:office" xmlns:r="http://schemas.openxmlformats.org/officeDocument/2006/relationships" xmlns:m="http://schemas.openxmlformats.org/officeDocument/2006/math" xmlns:v="urn:schemas-microsoft-com:vml" xmlns:wp14="http://schemas.microsoft.com/office/word/2010/wordprocessingDrawing" xmlns:wp="http://schemas.openxmlformats.org/drawingml/2006/wordprocessingDrawing" xmlns:w10="urn:schemas-microsoft-com:office:word" xmlns:w="http://schemas.openxmlformats.org/wordprocessingml/2006/main" xmlns:w14="http://schemas.microsoft.com/office/word/2010/wordml" xmlns:w15="http://schemas.microsoft.com/office/word/2012/wordml" xmlns:wpg="http://schemas.microsoft.com/office/word/2010/wordprocessingGroup" xmlns:wpi="http://schemas.microsoft.com/office/word/2010/wordprocessingInk" xmlns:wne="http://schemas.microsoft.com/office/word/2006/wordml" xmlns:wps="http://schemas.microsoft.com/office/word/2010/wordprocessingShape" xmlns:cx="http://schemas.microsoft.com/office/drawing/2014/chartex" xmlns:cx1="http://schemas.microsoft.com/office/drawing/2015/9/8/chartex" xmlns:cx2="http://schemas.microsoft.com/office/drawing/2015/10/21/chartex" xmlns:cx3="http://schemas.microsoft.com/office/drawing/2016/5/9/chartex" xmlns:cx4="http://schemas.microsoft.com/office/drawing/2016/5/10/chartex" xmlns:cx5="http://schemas.microsoft.com/office/drawing/2016/5/11/chartex" xmlns:cx6="http://schemas.microsoft.com/office/drawing/2016/5/12/chartex" xmlns:cx7="http://schemas.microsoft.com/office/drawing/2016/5/13/chartex" xmlns:cx8="http://schemas.microsoft.com/office/drawing/2016/5/14/chartex" xmlns:w16cid="http://schemas.microsoft.com/office/word/2016/wordml/cid" xmlns:w16se="http://schemas.microsoft.com/office/word/2015/wordml/symex"/>
+<w:hdr xmlns:wpc="http://schemas.microsoft.com/office/word/2010/wordprocessingCanvas" xmlns:mc="http://schemas.openxmlformats.org/markup-compatibility/2006" xmlns:o="urn:schemas-microsoft-com:office:office" xmlns:r="http://schemas.openxmlformats.org/officeDocument/2006/relationships" xmlns:m="http://schemas.openxmlformats.org/officeDocument/2006/math" xmlns:v="urn:schemas-microsoft-com:vml" xmlns:wp14="http://schemas.microsoft.com/office/word/2010/wordprocessingDrawing" xmlns:wp="http://schemas.openxmlformats.org/drawingml/2006/wordprocessingDrawing" xmlns:w10="urn:schemas-microsoft-com:office:word" xmlns:w="http://schemas.openxmlformats.org/wordprocessingml/2006/main" xmlns:w14="http://schemas.microsoft.com/office/word/2010/wordml" xmlns:w15="http://schemas.microsoft.com/office/word/2012/wordml" xmlns:wpg="http://schemas.microsoft.com/office/word/2010/wordprocessingGroup" xmlns:wpi="http://schemas.microsoft.com/office/word/2010/wordprocessingInk" xmlns:wne="http://schemas.microsoft.com/office/word/2006/wordml" xmlns:wps="http://schemas.microsoft.com/office/word/2010/wordprocessingShape" xmlns:cx="http://schemas.microsoft.com/office/drawing/2014/chartex" xmlns:cx1="http://schemas.microsoft.com/office/drawing/2015/9/8/chartex" xmlns:cx2="http://schemas.microsoft.com/office/drawing/2015/10/21/chartex" xmlns:cx3="http://schemas.microsoft.com/office/drawing/2016/5/9/chartex" xmlns:cx4="http://schemas.microsoft.com/office/drawing/2016/5/10/chartex" xmlns:cx5="http://schemas.microsoft.com/office/drawing/2016/5/11/chartex" xmlns:cx6="http://schemas.microsoft.com/office/drawing/2016/5/12/chartex" xmlns:cx7="http://schemas.microsoft.com/office/drawing/2016/5/13/chartex" xmlns:cx8="http://schemas.microsoft.com/office/drawing/2016/5/14/chartex" xmlns:w16cid="http://schemas.microsoft.com/office/word/2016/wordml/cid" xmlns:w16se="http://schemas.microsoft.com/office/word/2015/wordml/symex">
+  <w:p>
+    <w:pPr>
+      <w:spacing w:after="0" w:before="0" w:line="240" w:lineRule="auto"/>
+    </w:pPr>
+  </w:p>
+</w:hdr>
 </file>
 
 <file path=word/numbering.xml><?xml version="1.0" encoding="utf-8"?>
 <w:numbering xmlns:wpc="http://schemas.microsoft.com/office/word/2010/wordprocessingCanvas" xmlns:mc="http://schemas.openxmlformats.org/markup-compatibility/2006" xmlns:o="urn:schemas-microsoft-com:office:office" xmlns:r="http://schemas.openxmlformats.org/officeDocument/2006/relationships" xmlns:m="http://schemas.openxmlformats.org/officeDocument/2006/math" xmlns:v="urn:schemas-microsoft-com:vml" xmlns:wp14="http://schemas.microsoft.com/office/word/2010/wordprocessingDrawing" xmlns:wp="http://schemas.openxmlformats.org/drawingml/2006/wordprocessingDrawing" xmlns:w10="urn:schemas-microsoft-com:office:word" xmlns:w="http://schemas.openxmlformats.org/wordprocessingml/2006/main" xmlns:w14="http://schemas.microsoft.com/office/word/2010/wordml" xmlns:w15="http://schemas.microsoft.com/office/word/2012/wordml" xmlns:wpg="http://schemas.microsoft.com/office/word/2010/wordprocessingGroup" xmlns:wpi="http://schemas.microsoft.com/office/word/2010/wordprocessingInk" xmlns:wne="http://schemas.microsoft.com/office/word/2006/wordml" xmlns:wps="http://schemas.microsoft.com/office/word/2010/wordprocessingShape" mc:Ignorable="w14 w15 wp14">
   <w:abstractNum w:abstractNumId="1" w15:restartNumberingAfterBreak="0">
     <w:multiLevelType w:val="hybridMultilevel"/>
-    <w:lvl w:ilvl="0" w15:tentative="1">
+    <w:lvl w:ilvl="0" w:tentative="1">
       <w:start w:val="1"/>
       <w:numFmt w:val="bullet"/>
       <w:lvlText w:val="●"/>
@@ -4654,7 +4846,7 @@
         <w:ind w:left="720" w:hanging="360"/>
       </w:pPr>
     </w:lvl>
-    <w:lvl w:ilvl="1" w15:tentative="1">
+    <w:lvl w:ilvl="1" w:tentative="1">
       <w:start w:val="1"/>
       <w:numFmt w:val="bullet"/>
       <w:lvlText w:val="○"/>
@@ -4663,7 +4855,7 @@
         <w:ind w:left="1440" w:hanging="360"/>
       </w:pPr>
     </w:lvl>
-    <w:lvl w:ilvl="2" w15:tentative="1">
+    <w:lvl w:ilvl="2" w:tentative="1">
       <w:start w:val="1"/>
       <w:numFmt w:val="bullet"/>
       <w:lvlText w:val="■"/>
@@ -4672,7 +4864,7 @@
         <w:ind w:left="2160" w:hanging="360"/>
       </w:pPr>
     </w:lvl>
-    <w:lvl w:ilvl="3" w15:tentative="1">
+    <w:lvl w:ilvl="3" w:tentative="1">
       <w:start w:val="1"/>
       <w:numFmt w:val="bullet"/>
       <w:lvlText w:val="●"/>
@@ -4681,7 +4873,7 @@
         <w:ind w:left="2880" w:hanging="360"/>
       </w:pPr>
     </w:lvl>
-    <w:lvl w:ilvl="4" w15:tentative="1">
+    <w:lvl w:ilvl="4" w:tentative="1">
       <w:start w:val="1"/>
       <w:numFmt w:val="bullet"/>
       <w:lvlText w:val="○"/>
@@ -4690,7 +4882,7 @@
         <w:ind w:left="3600" w:hanging="360"/>
       </w:pPr>
     </w:lvl>
-    <w:lvl w:ilvl="5" w15:tentative="1">
+    <w:lvl w:ilvl="5" w:tentative="1">
       <w:start w:val="1"/>
       <w:numFmt w:val="bullet"/>
       <w:lvlText w:val="■"/>
@@ -4699,7 +4891,7 @@
         <w:ind w:left="4320" w:hanging="360"/>
       </w:pPr>
     </w:lvl>
-    <w:lvl w:ilvl="6" w15:tentative="1">
+    <w:lvl w:ilvl="6" w:tentative="1">
       <w:start w:val="1"/>
       <w:numFmt w:val="bullet"/>
       <w:lvlText w:val="●"/>
@@ -4708,7 +4900,7 @@
         <w:ind w:left="5040" w:hanging="360"/>
       </w:pPr>
     </w:lvl>
-    <w:lvl w:ilvl="7" w15:tentative="1">
+    <w:lvl w:ilvl="7" w:tentative="1">
       <w:start w:val="1"/>
       <w:numFmt w:val="bullet"/>
       <w:lvlText w:val="●"/>
@@ -4717,7 +4909,7 @@
         <w:ind w:left="5760" w:hanging="360"/>
       </w:pPr>
     </w:lvl>
-    <w:lvl w:ilvl="8" w15:tentative="1">
+    <w:lvl w:ilvl="8" w:tentative="1">
       <w:start w:val="1"/>
       <w:numFmt w:val="bullet"/>
       <w:lvlText w:val="●"/>
@@ -4729,7 +4921,7 @@
   </w:abstractNum>
   <w:abstractNum w:abstractNumId="2" w15:restartNumberingAfterBreak="0">
     <w:multiLevelType w:val="hybridMultilevel"/>
-    <w:lvl w:ilvl="0" w15:tentative="1">
+    <w:lvl w:ilvl="0" w:tentative="1">
       <w:start w:val="1"/>
       <w:numFmt w:val="bullet"/>
       <w:lvlText w:val="●"/>
@@ -4738,11 +4930,12 @@
         <w:ind w:left="720" w:hanging="360"/>
       </w:pPr>
       <w:rPr>
+        <w:rFonts w:ascii="Google Sans Flex Normal" w:cs="Google Sans Flex Normal" w:eastAsia="Google Sans Flex Normal" w:hAnsi="Google Sans Flex Normal"/>
         <w:sz w:val="20"/>
         <w:szCs w:val="20"/>
       </w:rPr>
     </w:lvl>
-    <w:lvl w:ilvl="1" w15:tentative="1">
+    <w:lvl w:ilvl="1" w:tentative="1">
       <w:start w:val="1"/>
       <w:numFmt w:val="bullet"/>
       <w:lvlText w:val="–"/>
@@ -4751,35 +4944,7 @@
         <w:ind w:left="1080" w:hanging="360"/>
       </w:pPr>
       <w:rPr>
-        <w:sz w:val="20"/>
-        <w:szCs w:val="20"/>
-      </w:rPr>
-    </w:lvl>
-  </w:abstractNum>
-  <w:abstractNum w:abstractNumId="3" w15:restartNumberingAfterBreak="0">
-    <w:multiLevelType w:val="hybridMultilevel"/>
-    <w:lvl w:ilvl="0" w15:tentative="1">
-      <w:start w:val="1"/>
-      <w:numFmt w:val="decimal"/>
-      <w:lvlText w:val="%1."/>
-      <w:lvlJc w:val="left"/>
-      <w:pPr>
-        <w:ind w:left="720" w:hanging="360"/>
-      </w:pPr>
-      <w:rPr>
-        <w:sz w:val="20"/>
-        <w:szCs w:val="20"/>
-      </w:rPr>
-    </w:lvl>
-    <w:lvl w:ilvl="1" w15:tentative="1">
-      <w:start w:val="1"/>
-      <w:numFmt w:val="decimal"/>
-      <w:lvlText w:val="%2."/>
-      <w:lvlJc w:val="left"/>
-      <w:pPr>
-        <w:ind w:left="1080" w:hanging="360"/>
-      </w:pPr>
-      <w:rPr>
+        <w:rFonts w:ascii="Google Sans Flex Normal" w:cs="Google Sans Flex Normal" w:eastAsia="Google Sans Flex Normal" w:hAnsi="Google Sans Flex Normal"/>
         <w:sz w:val="20"/>
         <w:szCs w:val="20"/>
       </w:rPr>
@@ -4794,6 +4959,9 @@
   <w:num w:numId="2">
     <w:abstractNumId w:val="2"/>
     <w:lvlOverride w:ilvl="0">
+      <w:startOverride w:val="1"/>
+    </w:lvlOverride>
+    <w:lvlOverride w:ilvl="1">
       <w:startOverride w:val="1"/>
     </w:lvlOverride>
   </w:num>
@@ -4817,6 +4985,25 @@
       </w:pPr>
     </w:pPrDefault>
   </w:docDefaults>
+  <w:style w:type="paragraph" w:styleId="Normal" w:default="1">
+    <w:name w:val="Normal"/>
+    <w:qFormat/>
+  </w:style>
+  <w:style w:type="table" w:styleId="TableNormal" w:default="true">
+    <w:name w:val="Normal Table"/>
+    <w:uiPriority w:val="99"/>
+    <w:semiHidden/>
+    <w:unhideWhenUsed/>
+    <w:tblPr>
+      <w:tblInd w:type="dxa" w:w="0"/>
+      <w:tblCellMar>
+        <w:top w:type="dxa" w:w="0"/>
+        <w:left w:type="dxa" w:w="108"/>
+        <w:bottom w:type="dxa" w:w="0"/>
+        <w:right w:type="dxa" w:w="108"/>
+      </w:tblCellMar>
+    </w:tblPr>
+  </w:style>
   <w:style w:type="paragraph" w:styleId="Title">
     <w:name w:val="Title"/>
     <w:basedOn w:val="Normal"/>
@@ -4825,50 +5012,6 @@
     <w:rPr>
       <w:sz w:val="56"/>
       <w:szCs w:val="56"/>
-    </w:rPr>
-  </w:style>
-  <w:style w:type="paragraph" w:styleId="Heading1">
-    <w:name w:val="Heading 1"/>
-    <w:basedOn w:val="Normal"/>
-    <w:next w:val="Normal"/>
-    <w:qFormat/>
-    <w:rPr>
-      <w:color w:val="2E74B5"/>
-      <w:sz w:val="32"/>
-      <w:szCs w:val="32"/>
-    </w:rPr>
-  </w:style>
-  <w:style w:type="paragraph" w:styleId="Heading2">
-    <w:name w:val="Heading 2"/>
-    <w:basedOn w:val="Normal"/>
-    <w:next w:val="Normal"/>
-    <w:qFormat/>
-    <w:rPr>
-      <w:color w:val="2E74B5"/>
-      <w:sz w:val="26"/>
-      <w:szCs w:val="26"/>
-    </w:rPr>
-  </w:style>
-  <w:style w:type="paragraph" w:styleId="Heading3">
-    <w:name w:val="Heading 3"/>
-    <w:basedOn w:val="Normal"/>
-    <w:next w:val="Normal"/>
-    <w:qFormat/>
-    <w:rPr>
-      <w:color w:val="1F4D78"/>
-      <w:sz w:val="24"/>
-      <w:szCs w:val="24"/>
-    </w:rPr>
-  </w:style>
-  <w:style w:type="paragraph" w:styleId="Heading4">
-    <w:name w:val="Heading 4"/>
-    <w:basedOn w:val="Normal"/>
-    <w:next w:val="Normal"/>
-    <w:qFormat/>
-    <w:rPr>
-      <w:i/>
-      <w:iCs/>
-      <w:color w:val="2E74B5"/>
     </w:rPr>
   </w:style>
   <w:style w:type="paragraph" w:styleId="Heading5">
@@ -4903,6 +5046,139 @@
     <w:name w:val="List Paragraph"/>
     <w:basedOn w:val="Normal"/>
     <w:qFormat/>
+  </w:style>
+  <w:style w:type="paragraph" w:styleId="Caption">
+    <w:name w:val="caption"/>
+    <w:basedOn w:val="Normal"/>
+    <w:next w:val="Normal"/>
+    <w:uiPriority w:val="35"/>
+    <w:semiHidden/>
+    <w:unhideWhenUsed/>
+    <w:qFormat/>
+    <w:pPr>
+      <w:spacing w:after="200"/>
+    </w:pPr>
+    <w:rPr>
+      <w:i/>
+      <w:iCs/>
+      <w:color w:val="44546A" w:themeColor="dark2"/>
+      <w:sz w:val="18"/>
+      <w:szCs w:val="18"/>
+    </w:rPr>
+  </w:style>
+  <w:style w:type="paragraph" w:styleId="Bibliography">
+    <w:name w:val="Bibliography"/>
+    <w:basedOn w:val="Normal"/>
+    <w:next w:val="Normal"/>
+    <w:uiPriority w:val="37"/>
+    <w:unhideWhenUsed/>
+  </w:style>
+  <w:style w:type="paragraph" w:styleId="TOC1">
+    <w:name w:val="toc 1"/>
+    <w:basedOn w:val="Normal"/>
+    <w:next w:val="Normal"/>
+    <w:uiPriority w:val="39"/>
+    <w:semiHidden/>
+    <w:unhideWhenUsed/>
+    <w:pPr>
+      <w:spacing w:after="100"/>
+    </w:pPr>
+  </w:style>
+  <w:style w:type="paragraph" w:styleId="TOC2">
+    <w:name w:val="toc 2"/>
+    <w:basedOn w:val="Normal"/>
+    <w:next w:val="Normal"/>
+    <w:uiPriority w:val="39"/>
+    <w:semiHidden/>
+    <w:unhideWhenUsed/>
+    <w:pPr>
+      <w:spacing w:after="100"/>
+      <w:ind w:left="220"/>
+    </w:pPr>
+  </w:style>
+  <w:style w:type="paragraph" w:styleId="TOC3">
+    <w:name w:val="toc 3"/>
+    <w:basedOn w:val="Normal"/>
+    <w:next w:val="Normal"/>
+    <w:uiPriority w:val="39"/>
+    <w:semiHidden/>
+    <w:unhideWhenUsed/>
+    <w:pPr>
+      <w:spacing w:after="100"/>
+      <w:ind w:left="440"/>
+    </w:pPr>
+  </w:style>
+  <w:style w:type="paragraph" w:styleId="TOC4">
+    <w:name w:val="toc 4"/>
+    <w:basedOn w:val="Normal"/>
+    <w:next w:val="Normal"/>
+    <w:uiPriority w:val="39"/>
+    <w:semiHidden/>
+    <w:unhideWhenUsed/>
+    <w:pPr>
+      <w:spacing w:after="100"/>
+      <w:ind w:left="660"/>
+    </w:pPr>
+  </w:style>
+  <w:style w:type="paragraph" w:styleId="TOC5">
+    <w:name w:val="toc 5"/>
+    <w:basedOn w:val="Normal"/>
+    <w:next w:val="Normal"/>
+    <w:uiPriority w:val="39"/>
+    <w:semiHidden/>
+    <w:unhideWhenUsed/>
+    <w:pPr>
+      <w:spacing w:after="100"/>
+      <w:ind w:left="880"/>
+    </w:pPr>
+  </w:style>
+  <w:style w:type="paragraph" w:styleId="TOC6">
+    <w:name w:val="toc 6"/>
+    <w:basedOn w:val="Normal"/>
+    <w:next w:val="Normal"/>
+    <w:uiPriority w:val="39"/>
+    <w:semiHidden/>
+    <w:unhideWhenUsed/>
+    <w:pPr>
+      <w:spacing w:after="100"/>
+      <w:ind w:left="1100"/>
+    </w:pPr>
+  </w:style>
+  <w:style w:type="paragraph" w:styleId="TOC7">
+    <w:name w:val="toc 7"/>
+    <w:basedOn w:val="Normal"/>
+    <w:next w:val="Normal"/>
+    <w:uiPriority w:val="39"/>
+    <w:semiHidden/>
+    <w:unhideWhenUsed/>
+    <w:pPr>
+      <w:spacing w:after="100"/>
+      <w:ind w:left="1320"/>
+    </w:pPr>
+  </w:style>
+  <w:style w:type="paragraph" w:styleId="TOC8">
+    <w:name w:val="toc 8"/>
+    <w:basedOn w:val="Normal"/>
+    <w:next w:val="Normal"/>
+    <w:uiPriority w:val="39"/>
+    <w:semiHidden/>
+    <w:unhideWhenUsed/>
+    <w:pPr>
+      <w:spacing w:after="100"/>
+      <w:ind w:left="1540"/>
+    </w:pPr>
+  </w:style>
+  <w:style w:type="paragraph" w:styleId="TOC9">
+    <w:name w:val="toc 9"/>
+    <w:basedOn w:val="Normal"/>
+    <w:next w:val="Normal"/>
+    <w:uiPriority w:val="39"/>
+    <w:semiHidden/>
+    <w:unhideWhenUsed/>
+    <w:pPr>
+      <w:spacing w:after="100"/>
+      <w:ind w:left="1760"/>
+    </w:pPr>
   </w:style>
   <w:style w:type="character" w:styleId="Hyperlink">
     <w:name w:val="Hyperlink"/>
@@ -4988,6 +5264,13 @@
       <w:szCs w:val="20"/>
     </w:rPr>
   </w:style>
+  <w:style w:type="character" w:styleId="LineNumber">
+    <w:name w:val="line number"/>
+    <w:basedOn w:val="DefaultParagraphFont"/>
+    <w:uiPriority w:val="99"/>
+    <w:semiHidden/>
+    <w:unhideWhenUsed/>
+  </w:style>
   <w:style w:type="paragraph" w:styleId="Heading1">
     <w:name w:val="Heading 1"/>
     <w:basedOn w:val="Normal"/>
@@ -5069,4 +5352,294 @@
     </w:rPr>
   </w:style>
 </w:styles>
+</file>
+
+<file path=word/theme/theme1.xml><?xml version="1.0" encoding="utf-8"?>
+<a:theme xmlns:a="http://schemas.openxmlformats.org/drawingml/2006/main" name="Office Theme">
+  <a:themeElements>
+    <a:clrScheme name="Office">
+      <a:dk1>
+        <a:sysClr val="windowText" lastClr="000000"/>
+      </a:dk1>
+      <a:lt1>
+        <a:sysClr val="window" lastClr="FFFFFF"/>
+      </a:lt1>
+      <a:dk2>
+        <a:srgbClr val="44546A"/>
+      </a:dk2>
+      <a:lt2>
+        <a:srgbClr val="E7E6E6"/>
+      </a:lt2>
+      <a:accent1>
+        <a:srgbClr val="4472C4"/>
+      </a:accent1>
+      <a:accent2>
+        <a:srgbClr val="ED7D31"/>
+      </a:accent2>
+      <a:accent3>
+        <a:srgbClr val="A5A5A5"/>
+      </a:accent3>
+      <a:accent4>
+        <a:srgbClr val="FFC000"/>
+      </a:accent4>
+      <a:accent5>
+        <a:srgbClr val="5B9BD5"/>
+      </a:accent5>
+      <a:accent6>
+        <a:srgbClr val="70AD47"/>
+      </a:accent6>
+      <a:hlink>
+        <a:srgbClr val="0563C1"/>
+      </a:hlink>
+      <a:folHlink>
+        <a:srgbClr val="954F72"/>
+      </a:folHlink>
+    </a:clrScheme>
+    <a:fontScheme name="Office">
+      <a:majorFont>
+        <a:latin typeface="Calibri Light" panose="020F0302020204030204"/>
+        <a:ea typeface=""/>
+        <a:cs typeface=""/>
+        <a:font script="Jpan" typeface="游ゴシック Light"/>
+        <a:font script="Hang" typeface="맑은 고딕"/>
+        <a:font script="Hans" typeface="等线 Light"/>
+        <a:font script="Hant" typeface="新細明體"/>
+        <a:font script="Arab" typeface="Times New Roman"/>
+        <a:font script="Hebr" typeface="Times New Roman"/>
+        <a:font script="Thai" typeface="Angsana New"/>
+        <a:font script="Ethi" typeface="Nyala"/>
+        <a:font script="Beng" typeface="Vrinda"/>
+        <a:font script="Gujr" typeface="Shruti"/>
+        <a:font script="Khmr" typeface="MoolBoran"/>
+        <a:font script="Knda" typeface="Tunga"/>
+        <a:font script="Guru" typeface="Raavi"/>
+        <a:font script="Cans" typeface="Euphemia"/>
+        <a:font script="Cher" typeface="Plantagenet Cherokee"/>
+        <a:font script="Yiii" typeface="Microsoft Yi Baiti"/>
+        <a:font script="Tibt" typeface="Microsoft Himalaya"/>
+        <a:font script="Thaa" typeface="MV Boli"/>
+        <a:font script="Deva" typeface="Mangal"/>
+        <a:font script="Telu" typeface="Gautami"/>
+        <a:font script="Taml" typeface="Latha"/>
+        <a:font script="Syrc" typeface="Estrangelo Edessa"/>
+        <a:font script="Orya" typeface="Kalinga"/>
+        <a:font script="Mlym" typeface="Kartika"/>
+        <a:font script="Laoo" typeface="DokChampa"/>
+        <a:font script="Sinh" typeface="Iskoola Pota"/>
+        <a:font script="Mong" typeface="Mongolian Baiti"/>
+        <a:font script="Viet" typeface="Times New Roman"/>
+        <a:font script="Uigh" typeface="Microsoft Uighur"/>
+        <a:font script="Geor" typeface="Sylfaen"/>
+        <a:font script="Armn" typeface="Arial"/>
+        <a:font script="Bugi" typeface="Leelawadee UI"/>
+        <a:font script="Bopo" typeface="Microsoft JhengHei"/>
+        <a:font script="Java" typeface="Javanese Text"/>
+        <a:font script="Lisu" typeface="Segoe UI"/>
+        <a:font script="Mymr" typeface="Myanmar Text"/>
+        <a:font script="Nkoo" typeface="Ebrima"/>
+        <a:font script="Olck" typeface="Nirmala UI"/>
+        <a:font script="Osma" typeface="Ebrima"/>
+        <a:font script="Phag" typeface="Phagspa"/>
+        <a:font script="Syrn" typeface="Estrangelo Edessa"/>
+        <a:font script="Syrj" typeface="Estrangelo Edessa"/>
+        <a:font script="Syre" typeface="Estrangelo Edessa"/>
+        <a:font script="Sora" typeface="Nirmala UI"/>
+        <a:font script="Tale" typeface="Microsoft Tai Le"/>
+        <a:font script="Talu" typeface="Microsoft New Tai Lue"/>
+        <a:font script="Tfng" typeface="Ebrima"/>
+      </a:majorFont>
+      <a:minorFont>
+        <a:latin typeface="Calibri" panose="020F0502020204030204"/>
+        <a:ea typeface=""/>
+        <a:cs typeface=""/>
+        <a:font script="Jpan" typeface="游明朝"/>
+        <a:font script="Hang" typeface="맑은 고딕"/>
+        <a:font script="Hans" typeface="等线"/>
+        <a:font script="Hant" typeface="新細明體"/>
+        <a:font script="Arab" typeface="Arial"/>
+        <a:font script="Hebr" typeface="Arial"/>
+        <a:font script="Thai" typeface="Cordia New"/>
+        <a:font script="Ethi" typeface="Nyala"/>
+        <a:font script="Beng" typeface="Vrinda"/>
+        <a:font script="Gujr" typeface="Shruti"/>
+        <a:font script="Khmr" typeface="DaunPenh"/>
+        <a:font script="Knda" typeface="Tunga"/>
+        <a:font script="Guru" typeface="Raavi"/>
+        <a:font script="Cans" typeface="Euphemia"/>
+        <a:font script="Cher" typeface="Plantagenet Cherokee"/>
+        <a:font script="Yiii" typeface="Microsoft Yi Baiti"/>
+        <a:font script="Tibt" typeface="Microsoft Himalaya"/>
+        <a:font script="Thaa" typeface="MV Boli"/>
+        <a:font script="Deva" typeface="Mangal"/>
+        <a:font script="Telu" typeface="Gautami"/>
+        <a:font script="Taml" typeface="Latha"/>
+        <a:font script="Syrc" typeface="Estrangelo Edessa"/>
+        <a:font script="Orya" typeface="Kalinga"/>
+        <a:font script="Mlym" typeface="Kartika"/>
+        <a:font script="Laoo" typeface="DokChampa"/>
+        <a:font script="Sinh" typeface="Iskoola Pota"/>
+        <a:font script="Mong" typeface="Mongolian Baiti"/>
+        <a:font script="Viet" typeface="Arial"/>
+        <a:font script="Uigh" typeface="Microsoft Uighur"/>
+        <a:font script="Geor" typeface="Sylfaen"/>
+        <a:font script="Armn" typeface="Arial"/>
+        <a:font script="Bugi" typeface="Leelawadee UI"/>
+        <a:font script="Bopo" typeface="Microsoft JhengHei"/>
+        <a:font script="Java" typeface="Javanese Text"/>
+        <a:font script="Lisu" typeface="Segoe UI"/>
+        <a:font script="Mymr" typeface="Myanmar Text"/>
+        <a:font script="Nkoo" typeface="Ebrima"/>
+        <a:font script="Olck" typeface="Nirmala UI"/>
+        <a:font script="Osma" typeface="Ebrima"/>
+        <a:font script="Phag" typeface="Phagspa"/>
+        <a:font script="Syrn" typeface="Estrangelo Edessa"/>
+        <a:font script="Syrj" typeface="Estrangelo Edessa"/>
+        <a:font script="Syre" typeface="Estrangelo Edessa"/>
+        <a:font script="Sora" typeface="Nirmala UI"/>
+        <a:font script="Tale" typeface="Microsoft Tai Le"/>
+        <a:font script="Talu" typeface="Microsoft New Tai Lue"/>
+        <a:font script="Tfng" typeface="Ebrima"/>
+      </a:minorFont>
+    </a:fontScheme>
+    <a:fmtScheme name="Office">
+      <a:fillStyleLst>
+        <a:solidFill>
+          <a:schemeClr val="phClr"/>
+        </a:solidFill>
+        <a:gradFill rotWithShape="true">
+          <a:gsLst>
+            <a:gs pos="0">
+              <a:schemeClr val="phClr">
+                <a:lumMod val="110000"/>
+                <a:satMod val="105000"/>
+                <a:tint val="67000"/>
+              </a:schemeClr>
+            </a:gs>
+            <a:gs pos="50000">
+              <a:schemeClr val="phClr">
+                <a:lumMod val="105000"/>
+                <a:satMod val="103000"/>
+                <a:tint val="73000"/>
+              </a:schemeClr>
+            </a:gs>
+            <a:gs pos="100000">
+              <a:schemeClr val="phClr">
+                <a:lumMod val="105000"/>
+                <a:satMod val="109000"/>
+                <a:tint val="81000"/>
+              </a:schemeClr>
+            </a:gs>
+          </a:gsLst>
+          <a:lin ang="5400000" scaled="false"/>
+        </a:gradFill>
+        <a:gradFill rotWithShape="true">
+          <a:gsLst>
+            <a:gs pos="0">
+              <a:schemeClr val="phClr">
+                <a:satMod val="103000"/>
+                <a:lumMod val="102000"/>
+                <a:tint val="94000"/>
+              </a:schemeClr>
+            </a:gs>
+            <a:gs pos="50000">
+              <a:schemeClr val="phClr">
+                <a:satMod val="110000"/>
+                <a:lumMod val="100000"/>
+                <a:shade val="100000"/>
+              </a:schemeClr>
+            </a:gs>
+            <a:gs pos="100000">
+              <a:schemeClr val="phClr">
+                <a:lumMod val="99000"/>
+                <a:satMod val="120000"/>
+                <a:shade val="78000"/>
+              </a:schemeClr>
+            </a:gs>
+          </a:gsLst>
+          <a:lin ang="5400000" scaled="false"/>
+        </a:gradFill>
+      </a:fillStyleLst>
+      <a:lnStyleLst>
+        <a:ln w="6350" cap="flat" cmpd="sng" algn="ctr">
+          <a:solidFill>
+            <a:schemeClr val="phClr"/>
+          </a:solidFill>
+          <a:prstDash val="solid"/>
+          <a:miter lim="800000"/>
+        </a:ln>
+        <a:ln w="12700" cap="flat" cmpd="sng" algn="ctr">
+          <a:solidFill>
+            <a:schemeClr val="phClr"/>
+          </a:solidFill>
+          <a:prstDash val="solid"/>
+          <a:miter lim="800000"/>
+        </a:ln>
+        <a:ln w="19050" cap="flat" cmpd="sng" algn="ctr">
+          <a:solidFill>
+            <a:schemeClr val="phClr"/>
+          </a:solidFill>
+          <a:prstDash val="solid"/>
+          <a:miter lim="800000"/>
+        </a:ln>
+      </a:lnStyleLst>
+      <a:effectStyleLst>
+        <a:effectStyle>
+          <a:effectLst/>
+        </a:effectStyle>
+        <a:effectStyle>
+          <a:effectLst/>
+        </a:effectStyle>
+        <a:effectStyle>
+          <a:effectLst>
+            <a:outerShdw blurRad="57150" dist="19050" dir="5400000" algn="ctr" rotWithShape="false">
+              <a:srgbClr val="000000">
+                <a:alpha val="63000"/>
+              </a:srgbClr>
+            </a:outerShdw>
+          </a:effectLst>
+        </a:effectStyle>
+      </a:effectStyleLst>
+      <a:bgFillStyleLst>
+        <a:solidFill>
+          <a:schemeClr val="phClr"/>
+        </a:solidFill>
+        <a:solidFill>
+          <a:schemeClr val="phClr">
+            <a:tint val="95000"/>
+            <a:satMod val="170000"/>
+          </a:schemeClr>
+        </a:solidFill>
+        <a:gradFill rotWithShape="true">
+          <a:gsLst>
+            <a:gs pos="0">
+              <a:schemeClr val="phClr">
+                <a:tint val="93000"/>
+                <a:satMod val="150000"/>
+                <a:shade val="98000"/>
+                <a:lumMod val="102000"/>
+              </a:schemeClr>
+            </a:gs>
+            <a:gs pos="50000">
+              <a:schemeClr val="phClr">
+                <a:tint val="98000"/>
+                <a:satMod val="130000"/>
+                <a:shade val="90000"/>
+                <a:lumMod val="103000"/>
+              </a:schemeClr>
+            </a:gs>
+            <a:gs pos="100000">
+              <a:schemeClr val="phClr">
+                <a:shade val="63000"/>
+                <a:satMod val="120000"/>
+              </a:schemeClr>
+            </a:gs>
+          </a:gsLst>
+          <a:lin ang="5400000" scaled="false"/>
+        </a:gradFill>
+      </a:bgFillStyleLst>
+    </a:fmtScheme>
+  </a:themeElements>
+  <a:objectDefaults/>
+  <a:extraClrSchemeLst/>
+</a:theme>
 </file>
</xml_diff>